<commit_message>
fix bugs not reading jabatan
</commit_message>
<xml_diff>
--- a/tutorial installasi.docx
+++ b/tutorial installasi.docx
@@ -551,6 +551,7 @@
           <w:tab w:val="left" w:leader="dot" w:pos="8789"/>
         </w:tabs>
         <w:spacing w:after="0" w:line="480" w:lineRule="auto"/>
+        <w:ind w:left="0" w:hanging="567"/>
         <w:rPr>
           <w:b/>
           <w:bCs/>
@@ -1238,6 +1239,7 @@
           <w:tab w:val="left" w:leader="dot" w:pos="8789"/>
         </w:tabs>
         <w:spacing w:after="0" w:line="360" w:lineRule="auto"/>
+        <w:ind w:left="0" w:hanging="578"/>
         <w:rPr>
           <w:b/>
           <w:bCs/>
@@ -1903,31 +1905,7 @@
           <w:color w:val="FF0000"/>
           <w:lang w:val="en-US"/>
         </w:rPr>
-        <w:t xml:space="preserve">SETELAH INSTALASI, </w:t>
-      </w:r>
-      <w:r>
-        <w:rPr>
-          <w:b/>
-          <w:bCs/>
-          <w:i/>
-          <w:iCs/>
-          <w:noProof/>
-          <w:color w:val="FF0000"/>
-          <w:lang w:val="en-US"/>
-        </w:rPr>
-        <w:t>CMD JANGAN DICLOSE</w:t>
-      </w:r>
-      <w:r>
-        <w:rPr>
-          <w:b/>
-          <w:bCs/>
-          <w:i/>
-          <w:iCs/>
-          <w:noProof/>
-          <w:color w:val="FF0000"/>
-          <w:lang w:val="en-US"/>
-        </w:rPr>
-        <w:t xml:space="preserve"> TERLEBIH DAHULU</w:t>
+        <w:t>SETELAH INSTALASI, CMD JANGAN DICLOSE TERLEBIH DAHULU</w:t>
       </w:r>
     </w:p>
     <w:p>
@@ -2511,6 +2489,7 @@
           <w:tab w:val="left" w:leader="dot" w:pos="8789"/>
         </w:tabs>
         <w:spacing w:after="0" w:line="360" w:lineRule="auto"/>
+        <w:ind w:left="0" w:hanging="567"/>
         <w:rPr>
           <w:b/>
           <w:bCs/>
@@ -2532,7 +2511,7 @@
           <w:lang w:val="en-US"/>
         </w:rPr>
         <w:lastRenderedPageBreak/>
-        <w:t>DALAM APLIKASI WEBSITE CUTI</w:t>
+        <w:t>BUAT AKUN AKSES WEBSITE (HAK KHUSUS ADMIN)</w:t>
       </w:r>
     </w:p>
     <w:p>
@@ -3137,13 +3116,13 @@
           <w:lang w:val="en-US"/>
         </w:rPr>
         <w:lastRenderedPageBreak/>
-        <w:t>Terlebih dahulu, buat akun Admin terbaru untuk menghindari peretasan. akun user (SDM) dan superuser</w:t>
-      </w:r>
-      <w:r>
-        <w:rPr>
-          <w:lang w:val="en-US"/>
-        </w:rPr>
-        <w:t xml:space="preserve"> (Kepala dan Direktur). Klik </w:t>
+        <w:t xml:space="preserve">Terlebih dahulu, buat akun Admin terbaru untuk menghindari peretasan. </w:t>
+      </w:r>
+      <w:r>
+        <w:rPr>
+          <w:lang w:val="en-US"/>
+        </w:rPr>
+        <w:t xml:space="preserve">Klik </w:t>
       </w:r>
       <w:r>
         <w:rPr>
@@ -3193,7 +3172,7 @@
           <w:lang w:val="en-US"/>
         </w:rPr>
         <w:drawing>
-          <wp:inline distT="0" distB="0" distL="0" distR="0" wp14:anchorId="3A807A95" wp14:editId="536E49FF">
+          <wp:inline distT="0" distB="0" distL="0" distR="0" wp14:anchorId="3A807A95" wp14:editId="6955ED8F">
             <wp:extent cx="5731510" cy="1180465"/>
             <wp:effectExtent l="0" t="0" r="2540" b="635"/>
             <wp:docPr id="298960207" name="Picture 35"/>
@@ -3305,10 +3284,10 @@
           <w:lang w:val="en-US"/>
         </w:rPr>
         <w:drawing>
-          <wp:inline distT="0" distB="0" distL="0" distR="0" wp14:anchorId="201F6456" wp14:editId="2C012CAD">
-            <wp:extent cx="2657475" cy="2739087"/>
-            <wp:effectExtent l="0" t="0" r="0" b="4445"/>
-            <wp:docPr id="51693844" name="Picture 36"/>
+          <wp:inline distT="0" distB="0" distL="0" distR="0" wp14:anchorId="4997D8F8" wp14:editId="60BEA174">
+            <wp:extent cx="2266950" cy="2355676"/>
+            <wp:effectExtent l="0" t="0" r="0" b="6985"/>
+            <wp:docPr id="1553686758" name="Picture 1"/>
             <wp:cNvGraphicFramePr>
               <a:graphicFrameLocks xmlns:a="http://schemas.openxmlformats.org/drawingml/2006/main" noChangeAspect="1"/>
             </wp:cNvGraphicFramePr>
@@ -3316,7 +3295,7 @@
               <a:graphicData uri="http://schemas.openxmlformats.org/drawingml/2006/picture">
                 <pic:pic xmlns:pic="http://schemas.openxmlformats.org/drawingml/2006/picture">
                   <pic:nvPicPr>
-                    <pic:cNvPr id="51693844" name="Picture 51693844"/>
+                    <pic:cNvPr id="1553686758" name="Picture 1553686758"/>
                     <pic:cNvPicPr/>
                   </pic:nvPicPr>
                   <pic:blipFill>
@@ -3334,7 +3313,7 @@
                   <pic:spPr>
                     <a:xfrm>
                       <a:off x="0" y="0"/>
-                      <a:ext cx="2677037" cy="2759249"/>
+                      <a:ext cx="2282665" cy="2372006"/>
                     </a:xfrm>
                     <a:prstGeom prst="rect">
                       <a:avLst/>
@@ -3352,6 +3331,74 @@
         <w:tabs>
           <w:tab w:val="left" w:leader="dot" w:pos="8789"/>
         </w:tabs>
+        <w:spacing w:after="0" w:line="360" w:lineRule="auto"/>
+        <w:jc w:val="center"/>
+        <w:rPr>
+          <w:b/>
+          <w:bCs/>
+          <w:noProof/>
+          <w:sz w:val="28"/>
+          <w:szCs w:val="28"/>
+          <w:lang w:val="en-US"/>
+        </w:rPr>
+      </w:pPr>
+      <w:r>
+        <w:rPr>
+          <w:b/>
+          <w:bCs/>
+          <w:noProof/>
+          <w:sz w:val="28"/>
+          <w:szCs w:val="28"/>
+          <w:lang w:val="en-US"/>
+        </w:rPr>
+        <w:drawing>
+          <wp:inline distT="0" distB="0" distL="0" distR="0" wp14:anchorId="201F6456" wp14:editId="7DB7F0C8">
+            <wp:extent cx="2352675" cy="2424925"/>
+            <wp:effectExtent l="0" t="0" r="0" b="0"/>
+            <wp:docPr id="51693844" name="Picture 36"/>
+            <wp:cNvGraphicFramePr>
+              <a:graphicFrameLocks xmlns:a="http://schemas.openxmlformats.org/drawingml/2006/main" noChangeAspect="1"/>
+            </wp:cNvGraphicFramePr>
+            <a:graphic xmlns:a="http://schemas.openxmlformats.org/drawingml/2006/main">
+              <a:graphicData uri="http://schemas.openxmlformats.org/drawingml/2006/picture">
+                <pic:pic xmlns:pic="http://schemas.openxmlformats.org/drawingml/2006/picture">
+                  <pic:nvPicPr>
+                    <pic:cNvPr id="51693844" name="Picture 51693844"/>
+                    <pic:cNvPicPr/>
+                  </pic:nvPicPr>
+                  <pic:blipFill>
+                    <a:blip r:embed="rId32">
+                      <a:extLst>
+                        <a:ext uri="{28A0092B-C50C-407E-A947-70E740481C1C}">
+                          <a14:useLocalDpi xmlns:a14="http://schemas.microsoft.com/office/drawing/2010/main" val="0"/>
+                        </a:ext>
+                      </a:extLst>
+                    </a:blip>
+                    <a:stretch>
+                      <a:fillRect/>
+                    </a:stretch>
+                  </pic:blipFill>
+                  <pic:spPr>
+                    <a:xfrm>
+                      <a:off x="0" y="0"/>
+                      <a:ext cx="2373352" cy="2446237"/>
+                    </a:xfrm>
+                    <a:prstGeom prst="rect">
+                      <a:avLst/>
+                    </a:prstGeom>
+                  </pic:spPr>
+                </pic:pic>
+              </a:graphicData>
+            </a:graphic>
+          </wp:inline>
+        </w:drawing>
+      </w:r>
+    </w:p>
+    <w:p>
+      <w:pPr>
+        <w:tabs>
+          <w:tab w:val="left" w:leader="dot" w:pos="8789"/>
+        </w:tabs>
         <w:spacing w:after="0" w:line="240" w:lineRule="auto"/>
         <w:jc w:val="center"/>
         <w:rPr>
@@ -3373,7 +3420,7 @@
           <w:lang w:val="en-US"/>
         </w:rPr>
         <w:drawing>
-          <wp:inline distT="0" distB="0" distL="0" distR="0" wp14:anchorId="2E688255" wp14:editId="0D1A579D">
+          <wp:inline distT="0" distB="0" distL="0" distR="0" wp14:anchorId="2E688255" wp14:editId="4E95F146">
             <wp:extent cx="5731510" cy="947420"/>
             <wp:effectExtent l="0" t="0" r="2540" b="5080"/>
             <wp:docPr id="1233700387" name="Picture 37"/>
@@ -3388,7 +3435,7 @@
                     <pic:cNvPicPr/>
                   </pic:nvPicPr>
                   <pic:blipFill>
-                    <a:blip r:embed="rId32" cstate="print">
+                    <a:blip r:embed="rId33" cstate="print">
                       <a:extLst>
                         <a:ext uri="{28A0092B-C50C-407E-A947-70E740481C1C}">
                           <a14:useLocalDpi xmlns:a14="http://schemas.microsoft.com/office/drawing/2010/main" val="0"/>
@@ -3477,6 +3524,31 @@
           <w:noProof/>
           <w:lang w:val="en-US"/>
         </w:rPr>
+        <w:t xml:space="preserve">Admin juga bisa membuat </w:t>
+      </w:r>
+      <w:r>
+        <w:rPr>
+          <w:noProof/>
+          <w:lang w:val="en-US"/>
+        </w:rPr>
+        <w:t>akun user (SDM) dan superuser</w:t>
+      </w:r>
+      <w:r>
+        <w:rPr>
+          <w:lang w:val="en-US"/>
+        </w:rPr>
+        <w:t xml:space="preserve"> (Kepala dan Direktur)</w:t>
+      </w:r>
+      <w:r>
+        <w:rPr>
+          <w:lang w:val="en-US"/>
+        </w:rPr>
+        <w:t xml:space="preserve"> dengan cara yang sama. Cukup mengisi jabatannya, hak akses akan otomatis terisi</w:t>
+      </w:r>
+      <w:r>
+        <w:rPr>
+          <w:lang w:val="en-US"/>
+        </w:rPr>
         <w:t>.</w:t>
       </w:r>
     </w:p>
@@ -3485,27 +3557,35 @@
         <w:pStyle w:val="ListParagraph"/>
         <w:numPr>
           <w:ilvl w:val="0"/>
-          <w:numId w:val="5"/>
+          <w:numId w:val="1"/>
         </w:numPr>
         <w:tabs>
           <w:tab w:val="left" w:leader="dot" w:pos="8789"/>
         </w:tabs>
         <w:spacing w:after="0" w:line="360" w:lineRule="auto"/>
-        <w:rPr>
-          <w:b/>
-          <w:bCs/>
-          <w:noProof/>
-          <w:sz w:val="28"/>
-          <w:szCs w:val="28"/>
-          <w:lang w:val="en-US"/>
-        </w:rPr>
-      </w:pPr>
-      <w:r>
-        <w:rPr>
-          <w:noProof/>
-          <w:lang w:val="en-US"/>
-        </w:rPr>
-        <w:t>.</w:t>
+        <w:ind w:left="0" w:hanging="567"/>
+        <w:rPr>
+          <w:b/>
+          <w:bCs/>
+          <w:noProof/>
+          <w:sz w:val="32"/>
+          <w:szCs w:val="32"/>
+          <w:u w:val="single"/>
+          <w:lang w:val="en-US"/>
+        </w:rPr>
+      </w:pPr>
+      <w:r>
+        <w:rPr>
+          <w:b/>
+          <w:bCs/>
+          <w:noProof/>
+          <w:sz w:val="32"/>
+          <w:szCs w:val="32"/>
+          <w:u w:val="single"/>
+          <w:lang w:val="en-US"/>
+        </w:rPr>
+        <w:lastRenderedPageBreak/>
+        <w:t>CARA MENGISI DATA PEGAWAI (HAK KHUSUS ADMIN)</w:t>
       </w:r>
     </w:p>
     <w:p>
@@ -3513,7 +3593,7 @@
         <w:pStyle w:val="ListParagraph"/>
         <w:numPr>
           <w:ilvl w:val="0"/>
-          <w:numId w:val="5"/>
+          <w:numId w:val="6"/>
         </w:numPr>
         <w:tabs>
           <w:tab w:val="left" w:leader="dot" w:pos="8789"/>
@@ -3530,10 +3610,165 @@
       </w:pPr>
       <w:r>
         <w:rPr>
-          <w:noProof/>
+          <w:lang w:val="en-US"/>
+        </w:rPr>
+        <w:t xml:space="preserve">Klik </w:t>
+      </w:r>
+      <w:r>
+        <w:rPr>
+          <w:b/>
+          <w:bCs/>
+          <w:lang w:val="en-US"/>
+        </w:rPr>
+        <w:t>ADMIN ONLY &gt; Isi Data Pegawai</w:t>
+      </w:r>
+      <w:r>
+        <w:rPr>
+          <w:lang w:val="en-US"/>
+        </w:rPr>
+        <w:t>. Lalu daftarkan data pegawai yang sesuai</w:t>
+      </w:r>
+      <w:r>
+        <w:rPr>
           <w:lang w:val="en-US"/>
         </w:rPr>
         <w:t>.</w:t>
+      </w:r>
+    </w:p>
+    <w:p>
+      <w:pPr>
+        <w:tabs>
+          <w:tab w:val="left" w:leader="dot" w:pos="8789"/>
+        </w:tabs>
+        <w:spacing w:after="0" w:line="360" w:lineRule="auto"/>
+        <w:jc w:val="center"/>
+        <w:rPr>
+          <w:b/>
+          <w:bCs/>
+          <w:noProof/>
+          <w:sz w:val="28"/>
+          <w:szCs w:val="28"/>
+          <w:lang w:val="en-US"/>
+        </w:rPr>
+      </w:pPr>
+      <w:r>
+        <w:rPr>
+          <w:b/>
+          <w:bCs/>
+          <w:noProof/>
+          <w:sz w:val="28"/>
+          <w:szCs w:val="28"/>
+          <w:lang w:val="en-US"/>
+        </w:rPr>
+        <w:drawing>
+          <wp:inline distT="0" distB="0" distL="0" distR="0" wp14:anchorId="1554741E" wp14:editId="7DEDF6FC">
+            <wp:extent cx="4600575" cy="1824225"/>
+            <wp:effectExtent l="0" t="0" r="0" b="5080"/>
+            <wp:docPr id="1965917370" name="Picture 2"/>
+            <wp:cNvGraphicFramePr>
+              <a:graphicFrameLocks xmlns:a="http://schemas.openxmlformats.org/drawingml/2006/main" noChangeAspect="1"/>
+            </wp:cNvGraphicFramePr>
+            <a:graphic xmlns:a="http://schemas.openxmlformats.org/drawingml/2006/main">
+              <a:graphicData uri="http://schemas.openxmlformats.org/drawingml/2006/picture">
+                <pic:pic xmlns:pic="http://schemas.openxmlformats.org/drawingml/2006/picture">
+                  <pic:nvPicPr>
+                    <pic:cNvPr id="1965917370" name="Picture 1965917370"/>
+                    <pic:cNvPicPr/>
+                  </pic:nvPicPr>
+                  <pic:blipFill>
+                    <a:blip r:embed="rId34" cstate="print">
+                      <a:extLst>
+                        <a:ext uri="{28A0092B-C50C-407E-A947-70E740481C1C}">
+                          <a14:useLocalDpi xmlns:a14="http://schemas.microsoft.com/office/drawing/2010/main" val="0"/>
+                        </a:ext>
+                      </a:extLst>
+                    </a:blip>
+                    <a:stretch>
+                      <a:fillRect/>
+                    </a:stretch>
+                  </pic:blipFill>
+                  <pic:spPr>
+                    <a:xfrm>
+                      <a:off x="0" y="0"/>
+                      <a:ext cx="4609984" cy="1827956"/>
+                    </a:xfrm>
+                    <a:prstGeom prst="rect">
+                      <a:avLst/>
+                    </a:prstGeom>
+                  </pic:spPr>
+                </pic:pic>
+              </a:graphicData>
+            </a:graphic>
+          </wp:inline>
+        </w:drawing>
+      </w:r>
+    </w:p>
+    <w:p>
+      <w:pPr>
+        <w:tabs>
+          <w:tab w:val="left" w:leader="dot" w:pos="8789"/>
+        </w:tabs>
+        <w:spacing w:after="0" w:line="360" w:lineRule="auto"/>
+        <w:jc w:val="center"/>
+        <w:rPr>
+          <w:b/>
+          <w:bCs/>
+          <w:noProof/>
+          <w:sz w:val="28"/>
+          <w:szCs w:val="28"/>
+          <w:lang w:val="en-US"/>
+        </w:rPr>
+      </w:pPr>
+      <w:r>
+        <w:rPr>
+          <w:b/>
+          <w:bCs/>
+          <w:noProof/>
+          <w:sz w:val="28"/>
+          <w:szCs w:val="28"/>
+          <w:lang w:val="en-US"/>
+        </w:rPr>
+        <w:drawing>
+          <wp:inline distT="0" distB="0" distL="0" distR="0" wp14:anchorId="3373EE1B" wp14:editId="51672B1E">
+            <wp:extent cx="4572000" cy="1797192"/>
+            <wp:effectExtent l="0" t="0" r="0" b="0"/>
+            <wp:docPr id="686161642" name="Picture 3"/>
+            <wp:cNvGraphicFramePr>
+              <a:graphicFrameLocks xmlns:a="http://schemas.openxmlformats.org/drawingml/2006/main" noChangeAspect="1"/>
+            </wp:cNvGraphicFramePr>
+            <a:graphic xmlns:a="http://schemas.openxmlformats.org/drawingml/2006/main">
+              <a:graphicData uri="http://schemas.openxmlformats.org/drawingml/2006/picture">
+                <pic:pic xmlns:pic="http://schemas.openxmlformats.org/drawingml/2006/picture">
+                  <pic:nvPicPr>
+                    <pic:cNvPr id="686161642" name="Picture 686161642"/>
+                    <pic:cNvPicPr/>
+                  </pic:nvPicPr>
+                  <pic:blipFill>
+                    <a:blip r:embed="rId35" cstate="print">
+                      <a:extLst>
+                        <a:ext uri="{28A0092B-C50C-407E-A947-70E740481C1C}">
+                          <a14:useLocalDpi xmlns:a14="http://schemas.microsoft.com/office/drawing/2010/main" val="0"/>
+                        </a:ext>
+                      </a:extLst>
+                    </a:blip>
+                    <a:stretch>
+                      <a:fillRect/>
+                    </a:stretch>
+                  </pic:blipFill>
+                  <pic:spPr>
+                    <a:xfrm>
+                      <a:off x="0" y="0"/>
+                      <a:ext cx="4579630" cy="1800191"/>
+                    </a:xfrm>
+                    <a:prstGeom prst="rect">
+                      <a:avLst/>
+                    </a:prstGeom>
+                  </pic:spPr>
+                </pic:pic>
+              </a:graphicData>
+            </a:graphic>
+          </wp:inline>
+        </w:drawing>
       </w:r>
     </w:p>
     <w:p>
@@ -3541,7 +3776,1268 @@
         <w:pStyle w:val="ListParagraph"/>
         <w:numPr>
           <w:ilvl w:val="0"/>
-          <w:numId w:val="5"/>
+          <w:numId w:val="6"/>
+        </w:numPr>
+        <w:tabs>
+          <w:tab w:val="left" w:leader="dot" w:pos="8789"/>
+        </w:tabs>
+        <w:spacing w:after="0" w:line="360" w:lineRule="auto"/>
+        <w:rPr>
+          <w:b/>
+          <w:bCs/>
+          <w:noProof/>
+          <w:sz w:val="28"/>
+          <w:szCs w:val="28"/>
+          <w:lang w:val="en-US"/>
+        </w:rPr>
+      </w:pPr>
+      <w:r>
+        <w:rPr>
+          <w:noProof/>
+          <w:lang w:val="en-US"/>
+        </w:rPr>
+        <w:t xml:space="preserve">Data yang didaftarkan akan ditampilkan lagi di </w:t>
+      </w:r>
+      <w:r>
+        <w:rPr>
+          <w:b/>
+          <w:bCs/>
+          <w:noProof/>
+          <w:lang w:val="en-US"/>
+        </w:rPr>
+        <w:t>Data Pegawai &gt; Pegawai</w:t>
+      </w:r>
+      <w:r>
+        <w:rPr>
+          <w:noProof/>
+          <w:lang w:val="en-US"/>
+        </w:rPr>
+        <w:t xml:space="preserve"> dan juga di dalam </w:t>
+      </w:r>
+      <w:r>
+        <w:rPr>
+          <w:b/>
+          <w:bCs/>
+          <w:noProof/>
+          <w:lang w:val="en-US"/>
+        </w:rPr>
+        <w:t>Form Pengajuan (HAK KHUSUS USER)</w:t>
+      </w:r>
+    </w:p>
+    <w:p>
+      <w:pPr>
+        <w:tabs>
+          <w:tab w:val="left" w:leader="dot" w:pos="8789"/>
+        </w:tabs>
+        <w:spacing w:after="0" w:line="360" w:lineRule="auto"/>
+        <w:jc w:val="center"/>
+        <w:rPr>
+          <w:b/>
+          <w:bCs/>
+          <w:noProof/>
+          <w:sz w:val="28"/>
+          <w:szCs w:val="28"/>
+          <w:lang w:val="en-US"/>
+        </w:rPr>
+      </w:pPr>
+      <w:r>
+        <w:rPr>
+          <w:b/>
+          <w:bCs/>
+          <w:noProof/>
+          <w:sz w:val="28"/>
+          <w:szCs w:val="28"/>
+          <w:lang w:val="en-US"/>
+        </w:rPr>
+        <w:drawing>
+          <wp:inline distT="0" distB="0" distL="0" distR="0" wp14:anchorId="6534927E" wp14:editId="0A39405F">
+            <wp:extent cx="4295775" cy="1764761"/>
+            <wp:effectExtent l="0" t="0" r="0" b="6985"/>
+            <wp:docPr id="142823627" name="Picture 4"/>
+            <wp:cNvGraphicFramePr>
+              <a:graphicFrameLocks xmlns:a="http://schemas.openxmlformats.org/drawingml/2006/main" noChangeAspect="1"/>
+            </wp:cNvGraphicFramePr>
+            <a:graphic xmlns:a="http://schemas.openxmlformats.org/drawingml/2006/main">
+              <a:graphicData uri="http://schemas.openxmlformats.org/drawingml/2006/picture">
+                <pic:pic xmlns:pic="http://schemas.openxmlformats.org/drawingml/2006/picture">
+                  <pic:nvPicPr>
+                    <pic:cNvPr id="142823627" name="Picture 142823627"/>
+                    <pic:cNvPicPr/>
+                  </pic:nvPicPr>
+                  <pic:blipFill>
+                    <a:blip r:embed="rId36" cstate="print">
+                      <a:extLst>
+                        <a:ext uri="{28A0092B-C50C-407E-A947-70E740481C1C}">
+                          <a14:useLocalDpi xmlns:a14="http://schemas.microsoft.com/office/drawing/2010/main" val="0"/>
+                        </a:ext>
+                      </a:extLst>
+                    </a:blip>
+                    <a:stretch>
+                      <a:fillRect/>
+                    </a:stretch>
+                  </pic:blipFill>
+                  <pic:spPr>
+                    <a:xfrm>
+                      <a:off x="0" y="0"/>
+                      <a:ext cx="4305488" cy="1768751"/>
+                    </a:xfrm>
+                    <a:prstGeom prst="rect">
+                      <a:avLst/>
+                    </a:prstGeom>
+                  </pic:spPr>
+                </pic:pic>
+              </a:graphicData>
+            </a:graphic>
+          </wp:inline>
+        </w:drawing>
+      </w:r>
+    </w:p>
+    <w:p>
+      <w:pPr>
+        <w:tabs>
+          <w:tab w:val="left" w:leader="dot" w:pos="8789"/>
+        </w:tabs>
+        <w:spacing w:after="0" w:line="360" w:lineRule="auto"/>
+        <w:jc w:val="center"/>
+        <w:rPr>
+          <w:b/>
+          <w:bCs/>
+          <w:noProof/>
+          <w:sz w:val="28"/>
+          <w:szCs w:val="28"/>
+          <w:lang w:val="en-US"/>
+        </w:rPr>
+      </w:pPr>
+      <w:r>
+        <w:rPr>
+          <w:b/>
+          <w:bCs/>
+          <w:noProof/>
+          <w:sz w:val="28"/>
+          <w:szCs w:val="28"/>
+          <w:lang w:val="en-US"/>
+        </w:rPr>
+        <w:lastRenderedPageBreak/>
+        <w:drawing>
+          <wp:inline distT="0" distB="0" distL="0" distR="0" wp14:anchorId="32E28AC8" wp14:editId="26DD1347">
+            <wp:extent cx="4200525" cy="1985010"/>
+            <wp:effectExtent l="0" t="0" r="9525" b="0"/>
+            <wp:docPr id="1010271662" name="Picture 5"/>
+            <wp:cNvGraphicFramePr>
+              <a:graphicFrameLocks xmlns:a="http://schemas.openxmlformats.org/drawingml/2006/main" noChangeAspect="1"/>
+            </wp:cNvGraphicFramePr>
+            <a:graphic xmlns:a="http://schemas.openxmlformats.org/drawingml/2006/main">
+              <a:graphicData uri="http://schemas.openxmlformats.org/drawingml/2006/picture">
+                <pic:pic xmlns:pic="http://schemas.openxmlformats.org/drawingml/2006/picture">
+                  <pic:nvPicPr>
+                    <pic:cNvPr id="1010271662" name="Picture 1010271662"/>
+                    <pic:cNvPicPr/>
+                  </pic:nvPicPr>
+                  <pic:blipFill>
+                    <a:blip r:embed="rId37" cstate="print">
+                      <a:extLst>
+                        <a:ext uri="{28A0092B-C50C-407E-A947-70E740481C1C}">
+                          <a14:useLocalDpi xmlns:a14="http://schemas.microsoft.com/office/drawing/2010/main" val="0"/>
+                        </a:ext>
+                      </a:extLst>
+                    </a:blip>
+                    <a:stretch>
+                      <a:fillRect/>
+                    </a:stretch>
+                  </pic:blipFill>
+                  <pic:spPr>
+                    <a:xfrm>
+                      <a:off x="0" y="0"/>
+                      <a:ext cx="4222150" cy="1995229"/>
+                    </a:xfrm>
+                    <a:prstGeom prst="rect">
+                      <a:avLst/>
+                    </a:prstGeom>
+                  </pic:spPr>
+                </pic:pic>
+              </a:graphicData>
+            </a:graphic>
+          </wp:inline>
+        </w:drawing>
+      </w:r>
+    </w:p>
+    <w:p>
+      <w:pPr>
+        <w:tabs>
+          <w:tab w:val="left" w:leader="dot" w:pos="8789"/>
+        </w:tabs>
+        <w:spacing w:after="0" w:line="360" w:lineRule="auto"/>
+        <w:jc w:val="center"/>
+        <w:rPr>
+          <w:b/>
+          <w:bCs/>
+          <w:noProof/>
+          <w:sz w:val="28"/>
+          <w:szCs w:val="28"/>
+          <w:lang w:val="en-US"/>
+        </w:rPr>
+      </w:pPr>
+    </w:p>
+    <w:p>
+      <w:pPr>
+        <w:pStyle w:val="ListParagraph"/>
+        <w:numPr>
+          <w:ilvl w:val="0"/>
+          <w:numId w:val="1"/>
+        </w:numPr>
+        <w:tabs>
+          <w:tab w:val="left" w:leader="dot" w:pos="8789"/>
+        </w:tabs>
+        <w:spacing w:after="0" w:line="360" w:lineRule="auto"/>
+        <w:ind w:left="0" w:right="-330" w:hanging="567"/>
+        <w:rPr>
+          <w:b/>
+          <w:bCs/>
+          <w:noProof/>
+          <w:sz w:val="28"/>
+          <w:szCs w:val="28"/>
+          <w:u w:val="single"/>
+          <w:lang w:val="en-US"/>
+        </w:rPr>
+      </w:pPr>
+      <w:r>
+        <w:rPr>
+          <w:b/>
+          <w:bCs/>
+          <w:noProof/>
+          <w:sz w:val="32"/>
+          <w:szCs w:val="32"/>
+          <w:u w:val="single"/>
+          <w:lang w:val="en-US"/>
+        </w:rPr>
+        <w:t>MELAKUKAN PENGAJUAN CUTI (HAK KHUSUS USER SDM)</w:t>
+      </w:r>
+    </w:p>
+    <w:p>
+      <w:pPr>
+        <w:pStyle w:val="ListParagraph"/>
+        <w:numPr>
+          <w:ilvl w:val="0"/>
+          <w:numId w:val="7"/>
+        </w:numPr>
+        <w:tabs>
+          <w:tab w:val="left" w:leader="dot" w:pos="8789"/>
+        </w:tabs>
+        <w:spacing w:after="0" w:line="360" w:lineRule="auto"/>
+        <w:rPr>
+          <w:b/>
+          <w:bCs/>
+          <w:noProof/>
+          <w:sz w:val="28"/>
+          <w:szCs w:val="28"/>
+          <w:lang w:val="en-US"/>
+        </w:rPr>
+      </w:pPr>
+      <w:r>
+        <w:rPr>
+          <w:noProof/>
+          <w:lang w:val="en-US"/>
+        </w:rPr>
+        <w:t xml:space="preserve">Klik </w:t>
+      </w:r>
+      <w:r>
+        <w:rPr>
+          <w:b/>
+          <w:bCs/>
+          <w:noProof/>
+          <w:lang w:val="en-US"/>
+        </w:rPr>
+        <w:t xml:space="preserve">Form Pengajuan </w:t>
+      </w:r>
+      <w:r>
+        <w:rPr>
+          <w:noProof/>
+          <w:lang w:val="en-US"/>
+        </w:rPr>
+        <w:t xml:space="preserve">di </w:t>
+      </w:r>
+      <w:r>
+        <w:rPr>
+          <w:i/>
+          <w:iCs/>
+          <w:noProof/>
+          <w:lang w:val="en-US"/>
+        </w:rPr>
+        <w:t>sidebar</w:t>
+      </w:r>
+      <w:r>
+        <w:rPr>
+          <w:noProof/>
+          <w:lang w:val="en-US"/>
+        </w:rPr>
+        <w:t xml:space="preserve"> (list di bagian kiri)</w:t>
+      </w:r>
+      <w:r>
+        <w:rPr>
+          <w:noProof/>
+          <w:lang w:val="en-US"/>
+        </w:rPr>
+        <w:t xml:space="preserve">, lalu isi semua data yang dibutuhkan (cukup memilih nama pegawai untuk </w:t>
+      </w:r>
+      <w:r>
+        <w:rPr>
+          <w:i/>
+          <w:iCs/>
+          <w:noProof/>
+          <w:lang w:val="en-US"/>
+        </w:rPr>
+        <w:t>autofill</w:t>
+      </w:r>
+      <w:r>
+        <w:rPr>
+          <w:noProof/>
+          <w:lang w:val="en-US"/>
+        </w:rPr>
+        <w:t xml:space="preserve"> semua bagian data pegawai).</w:t>
+      </w:r>
+    </w:p>
+    <w:p>
+      <w:pPr>
+        <w:tabs>
+          <w:tab w:val="left" w:leader="dot" w:pos="8789"/>
+        </w:tabs>
+        <w:spacing w:after="0" w:line="360" w:lineRule="auto"/>
+        <w:jc w:val="center"/>
+        <w:rPr>
+          <w:b/>
+          <w:bCs/>
+          <w:noProof/>
+          <w:sz w:val="28"/>
+          <w:szCs w:val="28"/>
+          <w:lang w:val="en-US"/>
+        </w:rPr>
+      </w:pPr>
+      <w:r>
+        <w:rPr>
+          <w:b/>
+          <w:bCs/>
+          <w:noProof/>
+          <w:sz w:val="28"/>
+          <w:szCs w:val="28"/>
+          <w:lang w:val="en-US"/>
+        </w:rPr>
+        <w:drawing>
+          <wp:inline distT="0" distB="0" distL="0" distR="0" wp14:anchorId="5C7D6E34" wp14:editId="6AE3A3B3">
+            <wp:extent cx="5076825" cy="2713339"/>
+            <wp:effectExtent l="0" t="0" r="0" b="0"/>
+            <wp:docPr id="1349405726" name="Picture 7"/>
+            <wp:cNvGraphicFramePr>
+              <a:graphicFrameLocks xmlns:a="http://schemas.openxmlformats.org/drawingml/2006/main" noChangeAspect="1"/>
+            </wp:cNvGraphicFramePr>
+            <a:graphic xmlns:a="http://schemas.openxmlformats.org/drawingml/2006/main">
+              <a:graphicData uri="http://schemas.openxmlformats.org/drawingml/2006/picture">
+                <pic:pic xmlns:pic="http://schemas.openxmlformats.org/drawingml/2006/picture">
+                  <pic:nvPicPr>
+                    <pic:cNvPr id="1349405726" name="Picture 1349405726"/>
+                    <pic:cNvPicPr/>
+                  </pic:nvPicPr>
+                  <pic:blipFill>
+                    <a:blip r:embed="rId38" cstate="print">
+                      <a:extLst>
+                        <a:ext uri="{28A0092B-C50C-407E-A947-70E740481C1C}">
+                          <a14:useLocalDpi xmlns:a14="http://schemas.microsoft.com/office/drawing/2010/main" val="0"/>
+                        </a:ext>
+                      </a:extLst>
+                    </a:blip>
+                    <a:stretch>
+                      <a:fillRect/>
+                    </a:stretch>
+                  </pic:blipFill>
+                  <pic:spPr>
+                    <a:xfrm>
+                      <a:off x="0" y="0"/>
+                      <a:ext cx="5094645" cy="2722863"/>
+                    </a:xfrm>
+                    <a:prstGeom prst="rect">
+                      <a:avLst/>
+                    </a:prstGeom>
+                  </pic:spPr>
+                </pic:pic>
+              </a:graphicData>
+            </a:graphic>
+          </wp:inline>
+        </w:drawing>
+      </w:r>
+    </w:p>
+    <w:p>
+      <w:pPr>
+        <w:tabs>
+          <w:tab w:val="left" w:leader="dot" w:pos="8789"/>
+        </w:tabs>
+        <w:spacing w:after="0" w:line="360" w:lineRule="auto"/>
+        <w:jc w:val="center"/>
+        <w:rPr>
+          <w:b/>
+          <w:bCs/>
+          <w:noProof/>
+          <w:sz w:val="28"/>
+          <w:szCs w:val="28"/>
+          <w:lang w:val="en-US"/>
+        </w:rPr>
+      </w:pPr>
+      <w:r>
+        <w:rPr>
+          <w:b/>
+          <w:bCs/>
+          <w:noProof/>
+          <w:sz w:val="28"/>
+          <w:szCs w:val="28"/>
+          <w:lang w:val="en-US"/>
+        </w:rPr>
+        <w:drawing>
+          <wp:inline distT="0" distB="0" distL="0" distR="0" wp14:anchorId="4897C923" wp14:editId="0EBFB085">
+            <wp:extent cx="5114925" cy="2733701"/>
+            <wp:effectExtent l="0" t="0" r="0" b="9525"/>
+            <wp:docPr id="694604100" name="Picture 8"/>
+            <wp:cNvGraphicFramePr>
+              <a:graphicFrameLocks xmlns:a="http://schemas.openxmlformats.org/drawingml/2006/main" noChangeAspect="1"/>
+            </wp:cNvGraphicFramePr>
+            <a:graphic xmlns:a="http://schemas.openxmlformats.org/drawingml/2006/main">
+              <a:graphicData uri="http://schemas.openxmlformats.org/drawingml/2006/picture">
+                <pic:pic xmlns:pic="http://schemas.openxmlformats.org/drawingml/2006/picture">
+                  <pic:nvPicPr>
+                    <pic:cNvPr id="694604100" name="Picture 694604100"/>
+                    <pic:cNvPicPr/>
+                  </pic:nvPicPr>
+                  <pic:blipFill>
+                    <a:blip r:embed="rId39" cstate="print">
+                      <a:extLst>
+                        <a:ext uri="{28A0092B-C50C-407E-A947-70E740481C1C}">
+                          <a14:useLocalDpi xmlns:a14="http://schemas.microsoft.com/office/drawing/2010/main" val="0"/>
+                        </a:ext>
+                      </a:extLst>
+                    </a:blip>
+                    <a:stretch>
+                      <a:fillRect/>
+                    </a:stretch>
+                  </pic:blipFill>
+                  <pic:spPr>
+                    <a:xfrm>
+                      <a:off x="0" y="0"/>
+                      <a:ext cx="5136742" cy="2745361"/>
+                    </a:xfrm>
+                    <a:prstGeom prst="rect">
+                      <a:avLst/>
+                    </a:prstGeom>
+                  </pic:spPr>
+                </pic:pic>
+              </a:graphicData>
+            </a:graphic>
+          </wp:inline>
+        </w:drawing>
+      </w:r>
+    </w:p>
+    <w:p>
+      <w:pPr>
+        <w:pStyle w:val="ListParagraph"/>
+        <w:numPr>
+          <w:ilvl w:val="0"/>
+          <w:numId w:val="7"/>
+        </w:numPr>
+        <w:tabs>
+          <w:tab w:val="left" w:leader="dot" w:pos="8789"/>
+        </w:tabs>
+        <w:spacing w:after="0" w:line="360" w:lineRule="auto"/>
+        <w:rPr>
+          <w:b/>
+          <w:bCs/>
+          <w:noProof/>
+          <w:sz w:val="28"/>
+          <w:szCs w:val="28"/>
+          <w:lang w:val="en-US"/>
+        </w:rPr>
+      </w:pPr>
+      <w:r>
+        <w:rPr>
+          <w:i/>
+          <w:iCs/>
+          <w:noProof/>
+          <w:lang w:val="en-US"/>
+        </w:rPr>
+        <w:lastRenderedPageBreak/>
+        <w:t xml:space="preserve">Form </w:t>
+      </w:r>
+      <w:r>
+        <w:rPr>
+          <w:noProof/>
+          <w:lang w:val="en-US"/>
+        </w:rPr>
+        <w:t xml:space="preserve">yang di </w:t>
+      </w:r>
+      <w:r>
+        <w:rPr>
+          <w:i/>
+          <w:iCs/>
+          <w:noProof/>
+          <w:lang w:val="en-US"/>
+        </w:rPr>
+        <w:t>submit</w:t>
+      </w:r>
+      <w:r>
+        <w:rPr>
+          <w:noProof/>
+          <w:lang w:val="en-US"/>
+        </w:rPr>
+        <w:t xml:space="preserve"> akan di tampilkan di </w:t>
+      </w:r>
+      <w:r>
+        <w:rPr>
+          <w:b/>
+          <w:bCs/>
+          <w:noProof/>
+          <w:lang w:val="en-US"/>
+        </w:rPr>
+        <w:t>Pengajuan &gt; Pengajuan Cuti</w:t>
+      </w:r>
+    </w:p>
+    <w:p>
+      <w:pPr>
+        <w:tabs>
+          <w:tab w:val="left" w:leader="dot" w:pos="8789"/>
+        </w:tabs>
+        <w:spacing w:after="0" w:line="360" w:lineRule="auto"/>
+        <w:rPr>
+          <w:b/>
+          <w:bCs/>
+          <w:noProof/>
+          <w:sz w:val="28"/>
+          <w:szCs w:val="28"/>
+          <w:lang w:val="en-US"/>
+        </w:rPr>
+      </w:pPr>
+      <w:r>
+        <w:rPr>
+          <w:b/>
+          <w:bCs/>
+          <w:noProof/>
+          <w:sz w:val="28"/>
+          <w:szCs w:val="28"/>
+          <w:lang w:val="en-US"/>
+        </w:rPr>
+        <w:drawing>
+          <wp:inline distT="0" distB="0" distL="0" distR="0" wp14:anchorId="2C6ED271" wp14:editId="51177F04">
+            <wp:extent cx="5731510" cy="1116330"/>
+            <wp:effectExtent l="0" t="0" r="2540" b="7620"/>
+            <wp:docPr id="302121946" name="Picture 9"/>
+            <wp:cNvGraphicFramePr>
+              <a:graphicFrameLocks xmlns:a="http://schemas.openxmlformats.org/drawingml/2006/main" noChangeAspect="1"/>
+            </wp:cNvGraphicFramePr>
+            <a:graphic xmlns:a="http://schemas.openxmlformats.org/drawingml/2006/main">
+              <a:graphicData uri="http://schemas.openxmlformats.org/drawingml/2006/picture">
+                <pic:pic xmlns:pic="http://schemas.openxmlformats.org/drawingml/2006/picture">
+                  <pic:nvPicPr>
+                    <pic:cNvPr id="302121946" name="Picture 302121946"/>
+                    <pic:cNvPicPr/>
+                  </pic:nvPicPr>
+                  <pic:blipFill>
+                    <a:blip r:embed="rId40" cstate="print">
+                      <a:extLst>
+                        <a:ext uri="{28A0092B-C50C-407E-A947-70E740481C1C}">
+                          <a14:useLocalDpi xmlns:a14="http://schemas.microsoft.com/office/drawing/2010/main" val="0"/>
+                        </a:ext>
+                      </a:extLst>
+                    </a:blip>
+                    <a:stretch>
+                      <a:fillRect/>
+                    </a:stretch>
+                  </pic:blipFill>
+                  <pic:spPr>
+                    <a:xfrm>
+                      <a:off x="0" y="0"/>
+                      <a:ext cx="5731510" cy="1116330"/>
+                    </a:xfrm>
+                    <a:prstGeom prst="rect">
+                      <a:avLst/>
+                    </a:prstGeom>
+                  </pic:spPr>
+                </pic:pic>
+              </a:graphicData>
+            </a:graphic>
+          </wp:inline>
+        </w:drawing>
+      </w:r>
+    </w:p>
+    <w:p>
+      <w:pPr>
+        <w:pStyle w:val="ListParagraph"/>
+        <w:numPr>
+          <w:ilvl w:val="0"/>
+          <w:numId w:val="7"/>
+        </w:numPr>
+        <w:tabs>
+          <w:tab w:val="left" w:leader="dot" w:pos="8789"/>
+        </w:tabs>
+        <w:spacing w:after="0" w:line="360" w:lineRule="auto"/>
+        <w:rPr>
+          <w:b/>
+          <w:bCs/>
+          <w:noProof/>
+          <w:sz w:val="28"/>
+          <w:szCs w:val="28"/>
+          <w:lang w:val="en-US"/>
+        </w:rPr>
+      </w:pPr>
+      <w:r>
+        <w:rPr>
+          <w:noProof/>
+          <w:lang w:val="en-US"/>
+        </w:rPr>
+        <w:t>Hak khusus yang hanya dimiliki SDM juga adalah dapat men-download semua data tabel pegawai, tabel pengajuan, tabel diterima, dan tabel ditolak.</w:t>
+      </w:r>
+    </w:p>
+    <w:p>
+      <w:pPr>
+        <w:tabs>
+          <w:tab w:val="left" w:leader="dot" w:pos="8789"/>
+        </w:tabs>
+        <w:spacing w:after="0" w:line="360" w:lineRule="auto"/>
+        <w:jc w:val="center"/>
+        <w:rPr>
+          <w:b/>
+          <w:bCs/>
+          <w:noProof/>
+          <w:sz w:val="28"/>
+          <w:szCs w:val="28"/>
+          <w:lang w:val="en-US"/>
+        </w:rPr>
+      </w:pPr>
+      <w:r>
+        <w:rPr>
+          <w:b/>
+          <w:bCs/>
+          <w:noProof/>
+          <w:sz w:val="28"/>
+          <w:szCs w:val="28"/>
+          <w:lang w:val="en-US"/>
+        </w:rPr>
+        <w:drawing>
+          <wp:inline distT="0" distB="0" distL="0" distR="0" wp14:anchorId="5AC5CBC7" wp14:editId="17740F10">
+            <wp:extent cx="5731510" cy="848995"/>
+            <wp:effectExtent l="0" t="0" r="2540" b="8255"/>
+            <wp:docPr id="1658693441" name="Picture 10"/>
+            <wp:cNvGraphicFramePr>
+              <a:graphicFrameLocks xmlns:a="http://schemas.openxmlformats.org/drawingml/2006/main" noChangeAspect="1"/>
+            </wp:cNvGraphicFramePr>
+            <a:graphic xmlns:a="http://schemas.openxmlformats.org/drawingml/2006/main">
+              <a:graphicData uri="http://schemas.openxmlformats.org/drawingml/2006/picture">
+                <pic:pic xmlns:pic="http://schemas.openxmlformats.org/drawingml/2006/picture">
+                  <pic:nvPicPr>
+                    <pic:cNvPr id="1658693441" name="Picture 1658693441"/>
+                    <pic:cNvPicPr/>
+                  </pic:nvPicPr>
+                  <pic:blipFill>
+                    <a:blip r:embed="rId41" cstate="print">
+                      <a:extLst>
+                        <a:ext uri="{28A0092B-C50C-407E-A947-70E740481C1C}">
+                          <a14:useLocalDpi xmlns:a14="http://schemas.microsoft.com/office/drawing/2010/main" val="0"/>
+                        </a:ext>
+                      </a:extLst>
+                    </a:blip>
+                    <a:stretch>
+                      <a:fillRect/>
+                    </a:stretch>
+                  </pic:blipFill>
+                  <pic:spPr>
+                    <a:xfrm>
+                      <a:off x="0" y="0"/>
+                      <a:ext cx="5731510" cy="848995"/>
+                    </a:xfrm>
+                    <a:prstGeom prst="rect">
+                      <a:avLst/>
+                    </a:prstGeom>
+                  </pic:spPr>
+                </pic:pic>
+              </a:graphicData>
+            </a:graphic>
+          </wp:inline>
+        </w:drawing>
+      </w:r>
+    </w:p>
+    <w:p>
+      <w:pPr>
+        <w:tabs>
+          <w:tab w:val="left" w:leader="dot" w:pos="8789"/>
+        </w:tabs>
+        <w:spacing w:after="0" w:line="360" w:lineRule="auto"/>
+        <w:jc w:val="center"/>
+        <w:rPr>
+          <w:b/>
+          <w:bCs/>
+          <w:noProof/>
+          <w:sz w:val="28"/>
+          <w:szCs w:val="28"/>
+          <w:lang w:val="en-US"/>
+        </w:rPr>
+      </w:pPr>
+      <w:r>
+        <w:rPr>
+          <w:b/>
+          <w:bCs/>
+          <w:noProof/>
+          <w:sz w:val="28"/>
+          <w:szCs w:val="28"/>
+          <w:lang w:val="en-US"/>
+        </w:rPr>
+        <w:drawing>
+          <wp:inline distT="0" distB="0" distL="0" distR="0" wp14:anchorId="698828E5" wp14:editId="76C7ACB3">
+            <wp:extent cx="5731510" cy="814705"/>
+            <wp:effectExtent l="0" t="0" r="2540" b="4445"/>
+            <wp:docPr id="349190715" name="Picture 11"/>
+            <wp:cNvGraphicFramePr>
+              <a:graphicFrameLocks xmlns:a="http://schemas.openxmlformats.org/drawingml/2006/main" noChangeAspect="1"/>
+            </wp:cNvGraphicFramePr>
+            <a:graphic xmlns:a="http://schemas.openxmlformats.org/drawingml/2006/main">
+              <a:graphicData uri="http://schemas.openxmlformats.org/drawingml/2006/picture">
+                <pic:pic xmlns:pic="http://schemas.openxmlformats.org/drawingml/2006/picture">
+                  <pic:nvPicPr>
+                    <pic:cNvPr id="349190715" name="Picture 349190715"/>
+                    <pic:cNvPicPr/>
+                  </pic:nvPicPr>
+                  <pic:blipFill>
+                    <a:blip r:embed="rId42" cstate="print">
+                      <a:extLst>
+                        <a:ext uri="{28A0092B-C50C-407E-A947-70E740481C1C}">
+                          <a14:useLocalDpi xmlns:a14="http://schemas.microsoft.com/office/drawing/2010/main" val="0"/>
+                        </a:ext>
+                      </a:extLst>
+                    </a:blip>
+                    <a:stretch>
+                      <a:fillRect/>
+                    </a:stretch>
+                  </pic:blipFill>
+                  <pic:spPr>
+                    <a:xfrm>
+                      <a:off x="0" y="0"/>
+                      <a:ext cx="5731510" cy="814705"/>
+                    </a:xfrm>
+                    <a:prstGeom prst="rect">
+                      <a:avLst/>
+                    </a:prstGeom>
+                  </pic:spPr>
+                </pic:pic>
+              </a:graphicData>
+            </a:graphic>
+          </wp:inline>
+        </w:drawing>
+      </w:r>
+    </w:p>
+    <w:p>
+      <w:pPr>
+        <w:tabs>
+          <w:tab w:val="left" w:leader="dot" w:pos="8789"/>
+        </w:tabs>
+        <w:spacing w:after="0" w:line="360" w:lineRule="auto"/>
+        <w:jc w:val="center"/>
+        <w:rPr>
+          <w:b/>
+          <w:bCs/>
+          <w:noProof/>
+          <w:sz w:val="28"/>
+          <w:szCs w:val="28"/>
+          <w:lang w:val="en-US"/>
+        </w:rPr>
+      </w:pPr>
+      <w:r>
+        <w:rPr>
+          <w:b/>
+          <w:bCs/>
+          <w:noProof/>
+          <w:sz w:val="28"/>
+          <w:szCs w:val="28"/>
+          <w:lang w:val="en-US"/>
+        </w:rPr>
+        <w:drawing>
+          <wp:inline distT="0" distB="0" distL="0" distR="0" wp14:anchorId="13FC7B6A" wp14:editId="613A0C6B">
+            <wp:extent cx="5731510" cy="829945"/>
+            <wp:effectExtent l="0" t="0" r="2540" b="8255"/>
+            <wp:docPr id="2085319691" name="Picture 12"/>
+            <wp:cNvGraphicFramePr>
+              <a:graphicFrameLocks xmlns:a="http://schemas.openxmlformats.org/drawingml/2006/main" noChangeAspect="1"/>
+            </wp:cNvGraphicFramePr>
+            <a:graphic xmlns:a="http://schemas.openxmlformats.org/drawingml/2006/main">
+              <a:graphicData uri="http://schemas.openxmlformats.org/drawingml/2006/picture">
+                <pic:pic xmlns:pic="http://schemas.openxmlformats.org/drawingml/2006/picture">
+                  <pic:nvPicPr>
+                    <pic:cNvPr id="2085319691" name="Picture 2085319691"/>
+                    <pic:cNvPicPr/>
+                  </pic:nvPicPr>
+                  <pic:blipFill>
+                    <a:blip r:embed="rId43" cstate="print">
+                      <a:extLst>
+                        <a:ext uri="{28A0092B-C50C-407E-A947-70E740481C1C}">
+                          <a14:useLocalDpi xmlns:a14="http://schemas.microsoft.com/office/drawing/2010/main" val="0"/>
+                        </a:ext>
+                      </a:extLst>
+                    </a:blip>
+                    <a:stretch>
+                      <a:fillRect/>
+                    </a:stretch>
+                  </pic:blipFill>
+                  <pic:spPr>
+                    <a:xfrm>
+                      <a:off x="0" y="0"/>
+                      <a:ext cx="5731510" cy="829945"/>
+                    </a:xfrm>
+                    <a:prstGeom prst="rect">
+                      <a:avLst/>
+                    </a:prstGeom>
+                  </pic:spPr>
+                </pic:pic>
+              </a:graphicData>
+            </a:graphic>
+          </wp:inline>
+        </w:drawing>
+      </w:r>
+    </w:p>
+    <w:p>
+      <w:pPr>
+        <w:tabs>
+          <w:tab w:val="left" w:leader="dot" w:pos="8789"/>
+        </w:tabs>
+        <w:spacing w:after="0" w:line="360" w:lineRule="auto"/>
+        <w:jc w:val="center"/>
+        <w:rPr>
+          <w:b/>
+          <w:bCs/>
+          <w:noProof/>
+          <w:sz w:val="28"/>
+          <w:szCs w:val="28"/>
+          <w:lang w:val="en-US"/>
+        </w:rPr>
+      </w:pPr>
+      <w:r>
+        <w:rPr>
+          <w:b/>
+          <w:bCs/>
+          <w:noProof/>
+          <w:sz w:val="28"/>
+          <w:szCs w:val="28"/>
+          <w:lang w:val="en-US"/>
+        </w:rPr>
+        <w:drawing>
+          <wp:inline distT="0" distB="0" distL="0" distR="0" wp14:anchorId="683901A8" wp14:editId="681C8A30">
+            <wp:extent cx="5731510" cy="1116965"/>
+            <wp:effectExtent l="0" t="0" r="2540" b="6985"/>
+            <wp:docPr id="43239032" name="Picture 13"/>
+            <wp:cNvGraphicFramePr>
+              <a:graphicFrameLocks xmlns:a="http://schemas.openxmlformats.org/drawingml/2006/main" noChangeAspect="1"/>
+            </wp:cNvGraphicFramePr>
+            <a:graphic xmlns:a="http://schemas.openxmlformats.org/drawingml/2006/main">
+              <a:graphicData uri="http://schemas.openxmlformats.org/drawingml/2006/picture">
+                <pic:pic xmlns:pic="http://schemas.openxmlformats.org/drawingml/2006/picture">
+                  <pic:nvPicPr>
+                    <pic:cNvPr id="43239032" name="Picture 43239032"/>
+                    <pic:cNvPicPr/>
+                  </pic:nvPicPr>
+                  <pic:blipFill>
+                    <a:blip r:embed="rId44" cstate="print">
+                      <a:extLst>
+                        <a:ext uri="{28A0092B-C50C-407E-A947-70E740481C1C}">
+                          <a14:useLocalDpi xmlns:a14="http://schemas.microsoft.com/office/drawing/2010/main" val="0"/>
+                        </a:ext>
+                      </a:extLst>
+                    </a:blip>
+                    <a:stretch>
+                      <a:fillRect/>
+                    </a:stretch>
+                  </pic:blipFill>
+                  <pic:spPr>
+                    <a:xfrm>
+                      <a:off x="0" y="0"/>
+                      <a:ext cx="5731510" cy="1116965"/>
+                    </a:xfrm>
+                    <a:prstGeom prst="rect">
+                      <a:avLst/>
+                    </a:prstGeom>
+                  </pic:spPr>
+                </pic:pic>
+              </a:graphicData>
+            </a:graphic>
+          </wp:inline>
+        </w:drawing>
+      </w:r>
+    </w:p>
+    <w:p>
+      <w:pPr>
+        <w:tabs>
+          <w:tab w:val="left" w:leader="dot" w:pos="8789"/>
+        </w:tabs>
+        <w:spacing w:after="0" w:line="360" w:lineRule="auto"/>
+        <w:jc w:val="center"/>
+        <w:rPr>
+          <w:b/>
+          <w:bCs/>
+          <w:noProof/>
+          <w:sz w:val="28"/>
+          <w:szCs w:val="28"/>
+          <w:lang w:val="en-US"/>
+        </w:rPr>
+      </w:pPr>
+    </w:p>
+    <w:p>
+      <w:pPr>
+        <w:tabs>
+          <w:tab w:val="left" w:leader="dot" w:pos="8789"/>
+        </w:tabs>
+        <w:spacing w:after="0" w:line="360" w:lineRule="auto"/>
+        <w:jc w:val="center"/>
+        <w:rPr>
+          <w:b/>
+          <w:bCs/>
+          <w:noProof/>
+          <w:sz w:val="28"/>
+          <w:szCs w:val="28"/>
+          <w:lang w:val="en-US"/>
+        </w:rPr>
+      </w:pPr>
+    </w:p>
+    <w:p>
+      <w:pPr>
+        <w:tabs>
+          <w:tab w:val="left" w:leader="dot" w:pos="8789"/>
+        </w:tabs>
+        <w:spacing w:after="0" w:line="360" w:lineRule="auto"/>
+        <w:jc w:val="center"/>
+        <w:rPr>
+          <w:b/>
+          <w:bCs/>
+          <w:noProof/>
+          <w:sz w:val="28"/>
+          <w:szCs w:val="28"/>
+          <w:lang w:val="en-US"/>
+        </w:rPr>
+      </w:pPr>
+    </w:p>
+    <w:p>
+      <w:pPr>
+        <w:tabs>
+          <w:tab w:val="left" w:leader="dot" w:pos="8789"/>
+        </w:tabs>
+        <w:spacing w:after="0" w:line="360" w:lineRule="auto"/>
+        <w:jc w:val="center"/>
+        <w:rPr>
+          <w:b/>
+          <w:bCs/>
+          <w:noProof/>
+          <w:sz w:val="28"/>
+          <w:szCs w:val="28"/>
+          <w:lang w:val="en-US"/>
+        </w:rPr>
+      </w:pPr>
+    </w:p>
+    <w:p>
+      <w:pPr>
+        <w:tabs>
+          <w:tab w:val="left" w:leader="dot" w:pos="8789"/>
+        </w:tabs>
+        <w:spacing w:after="0" w:line="360" w:lineRule="auto"/>
+        <w:jc w:val="center"/>
+        <w:rPr>
+          <w:b/>
+          <w:bCs/>
+          <w:noProof/>
+          <w:sz w:val="28"/>
+          <w:szCs w:val="28"/>
+          <w:lang w:val="en-US"/>
+        </w:rPr>
+      </w:pPr>
+    </w:p>
+    <w:p>
+      <w:pPr>
+        <w:tabs>
+          <w:tab w:val="left" w:leader="dot" w:pos="8789"/>
+        </w:tabs>
+        <w:spacing w:after="0" w:line="360" w:lineRule="auto"/>
+        <w:jc w:val="center"/>
+        <w:rPr>
+          <w:b/>
+          <w:bCs/>
+          <w:noProof/>
+          <w:sz w:val="28"/>
+          <w:szCs w:val="28"/>
+          <w:lang w:val="en-US"/>
+        </w:rPr>
+      </w:pPr>
+    </w:p>
+    <w:p>
+      <w:pPr>
+        <w:tabs>
+          <w:tab w:val="left" w:leader="dot" w:pos="8789"/>
+        </w:tabs>
+        <w:spacing w:after="0" w:line="360" w:lineRule="auto"/>
+        <w:jc w:val="center"/>
+        <w:rPr>
+          <w:b/>
+          <w:bCs/>
+          <w:noProof/>
+          <w:sz w:val="28"/>
+          <w:szCs w:val="28"/>
+          <w:lang w:val="en-US"/>
+        </w:rPr>
+      </w:pPr>
+    </w:p>
+    <w:p>
+      <w:pPr>
+        <w:tabs>
+          <w:tab w:val="left" w:leader="dot" w:pos="8789"/>
+        </w:tabs>
+        <w:spacing w:after="0" w:line="360" w:lineRule="auto"/>
+        <w:jc w:val="center"/>
+        <w:rPr>
+          <w:b/>
+          <w:bCs/>
+          <w:noProof/>
+          <w:sz w:val="28"/>
+          <w:szCs w:val="28"/>
+          <w:lang w:val="en-US"/>
+        </w:rPr>
+      </w:pPr>
+    </w:p>
+    <w:p>
+      <w:pPr>
+        <w:pStyle w:val="ListParagraph"/>
+        <w:numPr>
+          <w:ilvl w:val="0"/>
+          <w:numId w:val="1"/>
+        </w:numPr>
+        <w:tabs>
+          <w:tab w:val="left" w:leader="dot" w:pos="8789"/>
+        </w:tabs>
+        <w:spacing w:after="0" w:line="360" w:lineRule="auto"/>
+        <w:ind w:left="0" w:right="-330" w:hanging="567"/>
+        <w:rPr>
+          <w:b/>
+          <w:bCs/>
+          <w:noProof/>
+          <w:sz w:val="28"/>
+          <w:szCs w:val="28"/>
+          <w:lang w:val="en-US"/>
+        </w:rPr>
+      </w:pPr>
+      <w:r>
+        <w:rPr>
+          <w:b/>
+          <w:bCs/>
+          <w:noProof/>
+          <w:sz w:val="32"/>
+          <w:szCs w:val="32"/>
+          <w:u w:val="single"/>
+          <w:lang w:val="en-US"/>
+        </w:rPr>
+        <w:lastRenderedPageBreak/>
+        <w:t>MERESPON PENGAJUAN CUTI (HAK KHUSUS SUPERUSER KEPALA RRI DAN DIREKTUR RRI)</w:t>
+      </w:r>
+    </w:p>
+    <w:p>
+      <w:pPr>
+        <w:pStyle w:val="ListParagraph"/>
+        <w:numPr>
+          <w:ilvl w:val="0"/>
+          <w:numId w:val="8"/>
+        </w:numPr>
+        <w:tabs>
+          <w:tab w:val="left" w:leader="dot" w:pos="8789"/>
+        </w:tabs>
+        <w:spacing w:after="0" w:line="360" w:lineRule="auto"/>
+        <w:rPr>
+          <w:b/>
+          <w:bCs/>
+          <w:noProof/>
+          <w:sz w:val="28"/>
+          <w:szCs w:val="28"/>
+          <w:lang w:val="en-US"/>
+        </w:rPr>
+      </w:pPr>
+      <w:r>
+        <w:rPr>
+          <w:noProof/>
+          <w:lang w:val="en-US"/>
+        </w:rPr>
+        <w:t xml:space="preserve">Klik </w:t>
+      </w:r>
+      <w:r>
+        <w:rPr>
+          <w:b/>
+          <w:bCs/>
+          <w:noProof/>
+          <w:lang w:val="en-US"/>
+        </w:rPr>
+        <w:t xml:space="preserve">Pengajuan &gt; Pengajuan Cuti, </w:t>
+      </w:r>
+      <w:r>
+        <w:rPr>
+          <w:noProof/>
+          <w:lang w:val="en-US"/>
+        </w:rPr>
+        <w:t xml:space="preserve">lalu klik tombol </w:t>
+      </w:r>
+      <w:r>
+        <w:rPr>
+          <w:b/>
+          <w:bCs/>
+          <w:noProof/>
+          <w:lang w:val="en-US"/>
+        </w:rPr>
+        <w:t>Detail</w:t>
+      </w:r>
+      <w:r>
+        <w:rPr>
+          <w:b/>
+          <w:bCs/>
+          <w:lang w:val="en"/>
+        </w:rPr>
+        <w:t xml:space="preserve"> </w:t>
+      </w:r>
+      <w:r>
+        <w:rPr>
+          <w:noProof/>
+          <w:lang w:val="en"/>
+        </w:rPr>
+        <w:t>↓</w:t>
+      </w:r>
+      <w:r>
+        <w:rPr>
+          <w:noProof/>
+          <w:lang w:val="en"/>
+        </w:rPr>
+        <w:t xml:space="preserve"> (ditandai nomor </w:t>
+      </w:r>
+      <w:r>
+        <w:rPr>
+          <w:b/>
+          <w:bCs/>
+          <w:noProof/>
+          <w:lang w:val="en"/>
+        </w:rPr>
+        <w:t>1</w:t>
+      </w:r>
+      <w:r>
+        <w:rPr>
+          <w:noProof/>
+          <w:lang w:val="en"/>
+        </w:rPr>
+        <w:t xml:space="preserve">) lalu klik </w:t>
+      </w:r>
+      <w:r>
+        <w:rPr>
+          <w:b/>
+          <w:bCs/>
+          <w:noProof/>
+          <w:lang w:val="en"/>
+        </w:rPr>
+        <w:t>Choose File</w:t>
+      </w:r>
+      <w:r>
+        <w:rPr>
+          <w:b/>
+          <w:bCs/>
+          <w:noProof/>
+          <w:lang w:val="en"/>
+        </w:rPr>
+        <w:t xml:space="preserve"> </w:t>
+      </w:r>
+      <w:r>
+        <w:rPr>
+          <w:noProof/>
+          <w:lang w:val="en"/>
+        </w:rPr>
+        <w:t xml:space="preserve">(ditandai nomor </w:t>
+      </w:r>
+      <w:r>
+        <w:rPr>
+          <w:b/>
+          <w:bCs/>
+          <w:noProof/>
+          <w:lang w:val="en"/>
+        </w:rPr>
+        <w:t>2</w:t>
+      </w:r>
+      <w:r>
+        <w:rPr>
+          <w:noProof/>
+          <w:lang w:val="en"/>
+        </w:rPr>
+        <w:t>).</w:t>
+      </w:r>
+    </w:p>
+    <w:p>
+      <w:pPr>
+        <w:tabs>
+          <w:tab w:val="left" w:leader="dot" w:pos="8789"/>
+        </w:tabs>
+        <w:spacing w:after="0" w:line="360" w:lineRule="auto"/>
+        <w:rPr>
+          <w:b/>
+          <w:bCs/>
+          <w:noProof/>
+          <w:sz w:val="28"/>
+          <w:szCs w:val="28"/>
+          <w:lang w:val="en-US"/>
+        </w:rPr>
+      </w:pPr>
+      <w:r>
+        <w:rPr>
+          <w:b/>
+          <w:bCs/>
+          <w:noProof/>
+          <w:sz w:val="28"/>
+          <w:szCs w:val="28"/>
+          <w:lang w:val="en-US"/>
+        </w:rPr>
+        <w:drawing>
+          <wp:inline distT="0" distB="0" distL="0" distR="0" wp14:anchorId="625C5465" wp14:editId="3C10BE38">
+            <wp:extent cx="5731510" cy="1818005"/>
+            <wp:effectExtent l="0" t="0" r="2540" b="0"/>
+            <wp:docPr id="1365393052" name="Picture 14"/>
+            <wp:cNvGraphicFramePr>
+              <a:graphicFrameLocks xmlns:a="http://schemas.openxmlformats.org/drawingml/2006/main" noChangeAspect="1"/>
+            </wp:cNvGraphicFramePr>
+            <a:graphic xmlns:a="http://schemas.openxmlformats.org/drawingml/2006/main">
+              <a:graphicData uri="http://schemas.openxmlformats.org/drawingml/2006/picture">
+                <pic:pic xmlns:pic="http://schemas.openxmlformats.org/drawingml/2006/picture">
+                  <pic:nvPicPr>
+                    <pic:cNvPr id="1365393052" name="Picture 1365393052"/>
+                    <pic:cNvPicPr/>
+                  </pic:nvPicPr>
+                  <pic:blipFill>
+                    <a:blip r:embed="rId45" cstate="print">
+                      <a:extLst>
+                        <a:ext uri="{28A0092B-C50C-407E-A947-70E740481C1C}">
+                          <a14:useLocalDpi xmlns:a14="http://schemas.microsoft.com/office/drawing/2010/main" val="0"/>
+                        </a:ext>
+                      </a:extLst>
+                    </a:blip>
+                    <a:stretch>
+                      <a:fillRect/>
+                    </a:stretch>
+                  </pic:blipFill>
+                  <pic:spPr>
+                    <a:xfrm>
+                      <a:off x="0" y="0"/>
+                      <a:ext cx="5731510" cy="1818005"/>
+                    </a:xfrm>
+                    <a:prstGeom prst="rect">
+                      <a:avLst/>
+                    </a:prstGeom>
+                  </pic:spPr>
+                </pic:pic>
+              </a:graphicData>
+            </a:graphic>
+          </wp:inline>
+        </w:drawing>
+      </w:r>
+    </w:p>
+    <w:p>
+      <w:pPr>
+        <w:pStyle w:val="ListParagraph"/>
+        <w:numPr>
+          <w:ilvl w:val="0"/>
+          <w:numId w:val="8"/>
         </w:numPr>
         <w:tabs>
           <w:tab w:val="left" w:leader="dot" w:pos="8789"/>
@@ -3888,6 +5384,7 @@
           <w:noProof/>
           <w:lang w:val="id-ID"/>
         </w:rPr>
+        <w:lastRenderedPageBreak/>
         <w:t>“Pegawai disini mengajukan cuti melalui SDM, lalu SDM nanti akan mengirimkan blanko pengajuan kepada Direktur RRI Palembang untuk di konfirmasi” - OZ</w:t>
       </w:r>
     </w:p>
@@ -3948,6 +5445,184 @@
 <file path=word/numbering.xml><?xml version="1.0" encoding="utf-8"?>
 <w:numbering xmlns:wpc="http://schemas.microsoft.com/office/word/2010/wordprocessingCanvas" xmlns:cx="http://schemas.microsoft.com/office/drawing/2014/chartex" xmlns:cx1="http://schemas.microsoft.com/office/drawing/2015/9/8/chartex" xmlns:cx2="http://schemas.microsoft.com/office/drawing/2015/10/21/chartex" xmlns:cx3="http://schemas.microsoft.com/office/drawing/2016/5/9/chartex" xmlns:cx4="http://schemas.microsoft.com/office/drawing/2016/5/10/chartex" xmlns:cx5="http://schemas.microsoft.com/office/drawing/2016/5/11/chartex" xmlns:cx6="http://schemas.microsoft.com/office/drawing/2016/5/12/chartex" xmlns:cx7="http://schemas.microsoft.com/office/drawing/2016/5/13/chartex" xmlns:cx8="http://schemas.microsoft.com/office/drawing/2016/5/14/chartex" xmlns:mc="http://schemas.openxmlformats.org/markup-compatibility/2006" xmlns:aink="http://schemas.microsoft.com/office/drawing/2016/ink" xmlns:am3d="http://schemas.microsoft.com/office/drawing/2017/model3d" xmlns:o="urn:schemas-microsoft-com:office:office" xmlns:oel="http://schemas.microsoft.com/office/2019/extlst" xmlns:r="http://schemas.openxmlformats.org/officeDocument/2006/relationships" xmlns:m="http://schemas.openxmlformats.org/officeDocument/2006/math" xmlns:v="urn:schemas-microsoft-com:vml" xmlns:wp14="http://schemas.microsoft.com/office/word/2010/wordprocessingDrawing" xmlns:wp="http://schemas.openxmlformats.org/drawingml/2006/wordprocessingDrawing" xmlns:w10="urn:schemas-microsoft-com:office:word" xmlns:w="http://schemas.openxmlformats.org/wordprocessingml/2006/main" xmlns:w14="http://schemas.microsoft.com/office/word/2010/wordml" xmlns:w15="http://schemas.microsoft.com/office/word/2012/wordml" xmlns:w16cex="http://schemas.microsoft.com/office/word/2018/wordml/cex" xmlns:w16cid="http://schemas.microsoft.com/office/word/2016/wordml/cid" xmlns:w16="http://schemas.microsoft.com/office/word/2018/wordml" xmlns:w16du="http://schemas.microsoft.com/office/word/2023/wordml/word16du" xmlns:w16sdtdh="http://schemas.microsoft.com/office/word/2020/wordml/sdtdatahash" xmlns:w16se="http://schemas.microsoft.com/office/word/2015/wordml/symex" xmlns:wpg="http://schemas.microsoft.com/office/word/2010/wordprocessingGroup" xmlns:wpi="http://schemas.microsoft.com/office/word/2010/wordprocessingInk" xmlns:wne="http://schemas.microsoft.com/office/word/2006/wordml" xmlns:wps="http://schemas.microsoft.com/office/word/2010/wordprocessingShape" mc:Ignorable="w14 w15 w16se w16cid w16 w16cex w16sdtdh w16du wp14">
   <w:abstractNum w:abstractNumId="0" w15:restartNumberingAfterBreak="0">
+    <w:nsid w:val="01BB04B0"/>
+    <w:multiLevelType w:val="hybridMultilevel"/>
+    <w:tmpl w:val="282A1634"/>
+    <w:lvl w:ilvl="0" w:tplc="FFFFFFFF">
+      <w:start w:val="1"/>
+      <w:numFmt w:val="lowerLetter"/>
+      <w:lvlText w:val="%1."/>
+      <w:lvlJc w:val="left"/>
+      <w:pPr>
+        <w:ind w:left="720" w:hanging="360"/>
+      </w:pPr>
+      <w:rPr>
+        <w:rFonts w:hint="default"/>
+      </w:rPr>
+    </w:lvl>
+    <w:lvl w:ilvl="1" w:tplc="FFFFFFFF" w:tentative="1">
+      <w:start w:val="1"/>
+      <w:numFmt w:val="lowerLetter"/>
+      <w:lvlText w:val="%2."/>
+      <w:lvlJc w:val="left"/>
+      <w:pPr>
+        <w:ind w:left="1440" w:hanging="360"/>
+      </w:pPr>
+    </w:lvl>
+    <w:lvl w:ilvl="2" w:tplc="FFFFFFFF" w:tentative="1">
+      <w:start w:val="1"/>
+      <w:numFmt w:val="lowerRoman"/>
+      <w:lvlText w:val="%3."/>
+      <w:lvlJc w:val="right"/>
+      <w:pPr>
+        <w:ind w:left="2160" w:hanging="180"/>
+      </w:pPr>
+    </w:lvl>
+    <w:lvl w:ilvl="3" w:tplc="FFFFFFFF" w:tentative="1">
+      <w:start w:val="1"/>
+      <w:numFmt w:val="decimal"/>
+      <w:lvlText w:val="%4."/>
+      <w:lvlJc w:val="left"/>
+      <w:pPr>
+        <w:ind w:left="2880" w:hanging="360"/>
+      </w:pPr>
+    </w:lvl>
+    <w:lvl w:ilvl="4" w:tplc="FFFFFFFF" w:tentative="1">
+      <w:start w:val="1"/>
+      <w:numFmt w:val="lowerLetter"/>
+      <w:lvlText w:val="%5."/>
+      <w:lvlJc w:val="left"/>
+      <w:pPr>
+        <w:ind w:left="3600" w:hanging="360"/>
+      </w:pPr>
+    </w:lvl>
+    <w:lvl w:ilvl="5" w:tplc="FFFFFFFF" w:tentative="1">
+      <w:start w:val="1"/>
+      <w:numFmt w:val="lowerRoman"/>
+      <w:lvlText w:val="%6."/>
+      <w:lvlJc w:val="right"/>
+      <w:pPr>
+        <w:ind w:left="4320" w:hanging="180"/>
+      </w:pPr>
+    </w:lvl>
+    <w:lvl w:ilvl="6" w:tplc="FFFFFFFF" w:tentative="1">
+      <w:start w:val="1"/>
+      <w:numFmt w:val="decimal"/>
+      <w:lvlText w:val="%7."/>
+      <w:lvlJc w:val="left"/>
+      <w:pPr>
+        <w:ind w:left="5040" w:hanging="360"/>
+      </w:pPr>
+    </w:lvl>
+    <w:lvl w:ilvl="7" w:tplc="FFFFFFFF" w:tentative="1">
+      <w:start w:val="1"/>
+      <w:numFmt w:val="lowerLetter"/>
+      <w:lvlText w:val="%8."/>
+      <w:lvlJc w:val="left"/>
+      <w:pPr>
+        <w:ind w:left="5760" w:hanging="360"/>
+      </w:pPr>
+    </w:lvl>
+    <w:lvl w:ilvl="8" w:tplc="FFFFFFFF" w:tentative="1">
+      <w:start w:val="1"/>
+      <w:numFmt w:val="lowerRoman"/>
+      <w:lvlText w:val="%9."/>
+      <w:lvlJc w:val="right"/>
+      <w:pPr>
+        <w:ind w:left="6480" w:hanging="180"/>
+      </w:pPr>
+    </w:lvl>
+  </w:abstractNum>
+  <w:abstractNum w:abstractNumId="1" w15:restartNumberingAfterBreak="0">
+    <w:nsid w:val="02D8368E"/>
+    <w:multiLevelType w:val="hybridMultilevel"/>
+    <w:tmpl w:val="282A1634"/>
+    <w:lvl w:ilvl="0" w:tplc="FFFFFFFF">
+      <w:start w:val="1"/>
+      <w:numFmt w:val="lowerLetter"/>
+      <w:lvlText w:val="%1."/>
+      <w:lvlJc w:val="left"/>
+      <w:pPr>
+        <w:ind w:left="720" w:hanging="360"/>
+      </w:pPr>
+      <w:rPr>
+        <w:rFonts w:hint="default"/>
+      </w:rPr>
+    </w:lvl>
+    <w:lvl w:ilvl="1" w:tplc="FFFFFFFF" w:tentative="1">
+      <w:start w:val="1"/>
+      <w:numFmt w:val="lowerLetter"/>
+      <w:lvlText w:val="%2."/>
+      <w:lvlJc w:val="left"/>
+      <w:pPr>
+        <w:ind w:left="1440" w:hanging="360"/>
+      </w:pPr>
+    </w:lvl>
+    <w:lvl w:ilvl="2" w:tplc="FFFFFFFF" w:tentative="1">
+      <w:start w:val="1"/>
+      <w:numFmt w:val="lowerRoman"/>
+      <w:lvlText w:val="%3."/>
+      <w:lvlJc w:val="right"/>
+      <w:pPr>
+        <w:ind w:left="2160" w:hanging="180"/>
+      </w:pPr>
+    </w:lvl>
+    <w:lvl w:ilvl="3" w:tplc="FFFFFFFF" w:tentative="1">
+      <w:start w:val="1"/>
+      <w:numFmt w:val="decimal"/>
+      <w:lvlText w:val="%4."/>
+      <w:lvlJc w:val="left"/>
+      <w:pPr>
+        <w:ind w:left="2880" w:hanging="360"/>
+      </w:pPr>
+    </w:lvl>
+    <w:lvl w:ilvl="4" w:tplc="FFFFFFFF" w:tentative="1">
+      <w:start w:val="1"/>
+      <w:numFmt w:val="lowerLetter"/>
+      <w:lvlText w:val="%5."/>
+      <w:lvlJc w:val="left"/>
+      <w:pPr>
+        <w:ind w:left="3600" w:hanging="360"/>
+      </w:pPr>
+    </w:lvl>
+    <w:lvl w:ilvl="5" w:tplc="FFFFFFFF" w:tentative="1">
+      <w:start w:val="1"/>
+      <w:numFmt w:val="lowerRoman"/>
+      <w:lvlText w:val="%6."/>
+      <w:lvlJc w:val="right"/>
+      <w:pPr>
+        <w:ind w:left="4320" w:hanging="180"/>
+      </w:pPr>
+    </w:lvl>
+    <w:lvl w:ilvl="6" w:tplc="FFFFFFFF" w:tentative="1">
+      <w:start w:val="1"/>
+      <w:numFmt w:val="decimal"/>
+      <w:lvlText w:val="%7."/>
+      <w:lvlJc w:val="left"/>
+      <w:pPr>
+        <w:ind w:left="5040" w:hanging="360"/>
+      </w:pPr>
+    </w:lvl>
+    <w:lvl w:ilvl="7" w:tplc="FFFFFFFF" w:tentative="1">
+      <w:start w:val="1"/>
+      <w:numFmt w:val="lowerLetter"/>
+      <w:lvlText w:val="%8."/>
+      <w:lvlJc w:val="left"/>
+      <w:pPr>
+        <w:ind w:left="5760" w:hanging="360"/>
+      </w:pPr>
+    </w:lvl>
+    <w:lvl w:ilvl="8" w:tplc="FFFFFFFF" w:tentative="1">
+      <w:start w:val="1"/>
+      <w:numFmt w:val="lowerRoman"/>
+      <w:lvlText w:val="%9."/>
+      <w:lvlJc w:val="right"/>
+      <w:pPr>
+        <w:ind w:left="6480" w:hanging="180"/>
+      </w:pPr>
+    </w:lvl>
+  </w:abstractNum>
+  <w:abstractNum w:abstractNumId="2" w15:restartNumberingAfterBreak="0">
     <w:nsid w:val="305E387B"/>
     <w:multiLevelType w:val="hybridMultilevel"/>
     <w:tmpl w:val="F916793E"/>
@@ -4040,7 +5715,7 @@
       </w:pPr>
     </w:lvl>
   </w:abstractNum>
-  <w:abstractNum w:abstractNumId="1" w15:restartNumberingAfterBreak="0">
+  <w:abstractNum w:abstractNumId="3" w15:restartNumberingAfterBreak="0">
     <w:nsid w:val="36E767A7"/>
     <w:multiLevelType w:val="hybridMultilevel"/>
     <w:tmpl w:val="282A1634"/>
@@ -4129,7 +5804,7 @@
       </w:pPr>
     </w:lvl>
   </w:abstractNum>
-  <w:abstractNum w:abstractNumId="2" w15:restartNumberingAfterBreak="0">
+  <w:abstractNum w:abstractNumId="4" w15:restartNumberingAfterBreak="0">
     <w:nsid w:val="56F1301F"/>
     <w:multiLevelType w:val="hybridMultilevel"/>
     <w:tmpl w:val="A2C2584E"/>
@@ -4220,7 +5895,7 @@
       </w:pPr>
     </w:lvl>
   </w:abstractNum>
-  <w:abstractNum w:abstractNumId="3" w15:restartNumberingAfterBreak="0">
+  <w:abstractNum w:abstractNumId="5" w15:restartNumberingAfterBreak="0">
     <w:nsid w:val="5DAB21F8"/>
     <w:multiLevelType w:val="hybridMultilevel"/>
     <w:tmpl w:val="3836E60A"/>
@@ -4309,7 +5984,7 @@
       </w:pPr>
     </w:lvl>
   </w:abstractNum>
-  <w:abstractNum w:abstractNumId="4" w15:restartNumberingAfterBreak="0">
+  <w:abstractNum w:abstractNumId="6" w15:restartNumberingAfterBreak="0">
     <w:nsid w:val="778577EC"/>
     <w:multiLevelType w:val="hybridMultilevel"/>
     <w:tmpl w:val="C61214A4"/>
@@ -4402,19 +6077,117 @@
       </w:pPr>
     </w:lvl>
   </w:abstractNum>
+  <w:abstractNum w:abstractNumId="7" w15:restartNumberingAfterBreak="0">
+    <w:nsid w:val="7C436569"/>
+    <w:multiLevelType w:val="hybridMultilevel"/>
+    <w:tmpl w:val="282A1634"/>
+    <w:lvl w:ilvl="0" w:tplc="FFFFFFFF">
+      <w:start w:val="1"/>
+      <w:numFmt w:val="lowerLetter"/>
+      <w:lvlText w:val="%1."/>
+      <w:lvlJc w:val="left"/>
+      <w:pPr>
+        <w:ind w:left="720" w:hanging="360"/>
+      </w:pPr>
+      <w:rPr>
+        <w:rFonts w:hint="default"/>
+      </w:rPr>
+    </w:lvl>
+    <w:lvl w:ilvl="1" w:tplc="FFFFFFFF" w:tentative="1">
+      <w:start w:val="1"/>
+      <w:numFmt w:val="lowerLetter"/>
+      <w:lvlText w:val="%2."/>
+      <w:lvlJc w:val="left"/>
+      <w:pPr>
+        <w:ind w:left="1440" w:hanging="360"/>
+      </w:pPr>
+    </w:lvl>
+    <w:lvl w:ilvl="2" w:tplc="FFFFFFFF" w:tentative="1">
+      <w:start w:val="1"/>
+      <w:numFmt w:val="lowerRoman"/>
+      <w:lvlText w:val="%3."/>
+      <w:lvlJc w:val="right"/>
+      <w:pPr>
+        <w:ind w:left="2160" w:hanging="180"/>
+      </w:pPr>
+    </w:lvl>
+    <w:lvl w:ilvl="3" w:tplc="FFFFFFFF" w:tentative="1">
+      <w:start w:val="1"/>
+      <w:numFmt w:val="decimal"/>
+      <w:lvlText w:val="%4."/>
+      <w:lvlJc w:val="left"/>
+      <w:pPr>
+        <w:ind w:left="2880" w:hanging="360"/>
+      </w:pPr>
+    </w:lvl>
+    <w:lvl w:ilvl="4" w:tplc="FFFFFFFF" w:tentative="1">
+      <w:start w:val="1"/>
+      <w:numFmt w:val="lowerLetter"/>
+      <w:lvlText w:val="%5."/>
+      <w:lvlJc w:val="left"/>
+      <w:pPr>
+        <w:ind w:left="3600" w:hanging="360"/>
+      </w:pPr>
+    </w:lvl>
+    <w:lvl w:ilvl="5" w:tplc="FFFFFFFF" w:tentative="1">
+      <w:start w:val="1"/>
+      <w:numFmt w:val="lowerRoman"/>
+      <w:lvlText w:val="%6."/>
+      <w:lvlJc w:val="right"/>
+      <w:pPr>
+        <w:ind w:left="4320" w:hanging="180"/>
+      </w:pPr>
+    </w:lvl>
+    <w:lvl w:ilvl="6" w:tplc="FFFFFFFF" w:tentative="1">
+      <w:start w:val="1"/>
+      <w:numFmt w:val="decimal"/>
+      <w:lvlText w:val="%7."/>
+      <w:lvlJc w:val="left"/>
+      <w:pPr>
+        <w:ind w:left="5040" w:hanging="360"/>
+      </w:pPr>
+    </w:lvl>
+    <w:lvl w:ilvl="7" w:tplc="FFFFFFFF" w:tentative="1">
+      <w:start w:val="1"/>
+      <w:numFmt w:val="lowerLetter"/>
+      <w:lvlText w:val="%8."/>
+      <w:lvlJc w:val="left"/>
+      <w:pPr>
+        <w:ind w:left="5760" w:hanging="360"/>
+      </w:pPr>
+    </w:lvl>
+    <w:lvl w:ilvl="8" w:tplc="FFFFFFFF" w:tentative="1">
+      <w:start w:val="1"/>
+      <w:numFmt w:val="lowerRoman"/>
+      <w:lvlText w:val="%9."/>
+      <w:lvlJc w:val="right"/>
+      <w:pPr>
+        <w:ind w:left="6480" w:hanging="180"/>
+      </w:pPr>
+    </w:lvl>
+  </w:abstractNum>
   <w:num w:numId="1" w16cid:durableId="1327587404">
+    <w:abstractNumId w:val="4"/>
+  </w:num>
+  <w:num w:numId="2" w16cid:durableId="1495686188">
+    <w:abstractNumId w:val="6"/>
+  </w:num>
+  <w:num w:numId="3" w16cid:durableId="979768494">
     <w:abstractNumId w:val="2"/>
   </w:num>
-  <w:num w:numId="2" w16cid:durableId="1495686188">
-    <w:abstractNumId w:val="4"/>
+  <w:num w:numId="4" w16cid:durableId="1295671504">
+    <w:abstractNumId w:val="5"/>
   </w:num>
-  <w:num w:numId="3" w16cid:durableId="979768494">
+  <w:num w:numId="5" w16cid:durableId="54863644">
+    <w:abstractNumId w:val="3"/>
+  </w:num>
+  <w:num w:numId="6" w16cid:durableId="739644584">
+    <w:abstractNumId w:val="7"/>
+  </w:num>
+  <w:num w:numId="7" w16cid:durableId="257982019">
     <w:abstractNumId w:val="0"/>
   </w:num>
-  <w:num w:numId="4" w16cid:durableId="1295671504">
-    <w:abstractNumId w:val="3"/>
-  </w:num>
-  <w:num w:numId="5" w16cid:durableId="54863644">
+  <w:num w:numId="8" w16cid:durableId="506360233">
     <w:abstractNumId w:val="1"/>
   </w:num>
 </w:numbering>

</xml_diff>

<commit_message>
allow user to delete data tabel pengajuan
</commit_message>
<xml_diff>
--- a/tutorial installasi.docx
+++ b/tutorial installasi.docx
@@ -1141,7 +1141,28 @@
           <w:noProof/>
           <w:lang w:val="en-US"/>
         </w:rPr>
-        <w:t>Kembali ke XAMPP lalu klik tombol quit untuk menyimpan perubahan</w:t>
+        <w:t>Kembali ke XAMPP lalu klik tombol quit untuk me</w:t>
+      </w:r>
+      <w:r>
+        <w:rPr>
+          <w:noProof/>
+          <w:lang w:val="en-US"/>
+        </w:rPr>
+        <w:t>muat</w:t>
+      </w:r>
+      <w:r>
+        <w:rPr>
+          <w:noProof/>
+          <w:lang w:val="en-US"/>
+        </w:rPr>
+        <w:t xml:space="preserve"> perubahan</w:t>
+      </w:r>
+      <w:r>
+        <w:rPr>
+          <w:noProof/>
+          <w:lang w:val="en-US"/>
+        </w:rPr>
+        <w:t xml:space="preserve"> baru.</w:t>
       </w:r>
     </w:p>
     <w:p>
@@ -1227,6 +1248,13 @@
         </w:rPr>
         <w:t>Lalu buka kembali XAMPP dengan perubahan baru</w:t>
       </w:r>
+      <w:r>
+        <w:rPr>
+          <w:noProof/>
+          <w:lang w:val="en-US"/>
+        </w:rPr>
+        <w:t>.</w:t>
+      </w:r>
     </w:p>
     <w:p>
       <w:pPr>
@@ -1327,6 +1355,7 @@
         </w:tabs>
         <w:spacing w:after="0" w:line="360" w:lineRule="auto"/>
         <w:ind w:left="0"/>
+        <w:jc w:val="center"/>
         <w:rPr>
           <w:noProof/>
           <w:lang w:val="en-US"/>
@@ -1660,6 +1689,7 @@
           <w:tab w:val="left" w:leader="dot" w:pos="8789"/>
         </w:tabs>
         <w:spacing w:after="0" w:line="360" w:lineRule="auto"/>
+        <w:jc w:val="center"/>
         <w:rPr>
           <w:noProof/>
           <w:lang w:val="en-US"/>
@@ -1938,6 +1968,7 @@
           <w:tab w:val="left" w:leader="dot" w:pos="8789"/>
         </w:tabs>
         <w:spacing w:after="0" w:line="360" w:lineRule="auto"/>
+        <w:jc w:val="center"/>
         <w:rPr>
           <w:noProof/>
           <w:lang w:val="en-US"/>
@@ -2252,7 +2283,7 @@
           <w:bCs/>
           <w:noProof/>
         </w:rPr>
-        <w:t>–</w:t>
+        <w:t>--</w:t>
       </w:r>
       <w:r>
         <w:rPr>
@@ -2869,10 +2900,10 @@
           <w:lang w:val="en-US"/>
         </w:rPr>
         <w:drawing>
-          <wp:inline distT="0" distB="0" distL="0" distR="0" wp14:anchorId="0D6822BD" wp14:editId="752F1F00">
-            <wp:extent cx="5731510" cy="2962910"/>
-            <wp:effectExtent l="0" t="0" r="2540" b="8890"/>
-            <wp:docPr id="1402691133" name="Picture 33"/>
+          <wp:inline distT="0" distB="0" distL="0" distR="0" wp14:anchorId="685D0157" wp14:editId="6440572F">
+            <wp:extent cx="5731510" cy="2819400"/>
+            <wp:effectExtent l="0" t="0" r="2540" b="0"/>
+            <wp:docPr id="1963811083" name="Picture 2"/>
             <wp:cNvGraphicFramePr>
               <a:graphicFrameLocks xmlns:a="http://schemas.openxmlformats.org/drawingml/2006/main" noChangeAspect="1"/>
             </wp:cNvGraphicFramePr>
@@ -2880,7 +2911,7 @@
               <a:graphicData uri="http://schemas.openxmlformats.org/drawingml/2006/picture">
                 <pic:pic xmlns:pic="http://schemas.openxmlformats.org/drawingml/2006/picture">
                   <pic:nvPicPr>
-                    <pic:cNvPr id="1402691133" name="Picture 1402691133"/>
+                    <pic:cNvPr id="1963811083" name="Picture 1963811083"/>
                     <pic:cNvPicPr/>
                   </pic:nvPicPr>
                   <pic:blipFill>
@@ -2898,7 +2929,7 @@
                   <pic:spPr>
                     <a:xfrm>
                       <a:off x="0" y="0"/>
-                      <a:ext cx="5731510" cy="2962910"/>
+                      <a:ext cx="5731510" cy="2819400"/>
                     </a:xfrm>
                     <a:prstGeom prst="rect">
                       <a:avLst/>
@@ -2936,10 +2967,10 @@
           <w:lang w:val="en-US"/>
         </w:rPr>
         <w:drawing>
-          <wp:inline distT="0" distB="0" distL="0" distR="0" wp14:anchorId="3BA20796" wp14:editId="49199327">
-            <wp:extent cx="5731510" cy="2962910"/>
-            <wp:effectExtent l="0" t="0" r="2540" b="8890"/>
-            <wp:docPr id="1363093659" name="Picture 32"/>
+          <wp:inline distT="0" distB="0" distL="0" distR="0" wp14:anchorId="6736A333" wp14:editId="0910CACA">
+            <wp:extent cx="5731510" cy="2831465"/>
+            <wp:effectExtent l="0" t="0" r="2540" b="6985"/>
+            <wp:docPr id="1874212243" name="Picture 1"/>
             <wp:cNvGraphicFramePr>
               <a:graphicFrameLocks xmlns:a="http://schemas.openxmlformats.org/drawingml/2006/main" noChangeAspect="1"/>
             </wp:cNvGraphicFramePr>
@@ -2947,7 +2978,7 @@
               <a:graphicData uri="http://schemas.openxmlformats.org/drawingml/2006/picture">
                 <pic:pic xmlns:pic="http://schemas.openxmlformats.org/drawingml/2006/picture">
                   <pic:nvPicPr>
-                    <pic:cNvPr id="1363093659" name="Picture 1363093659"/>
+                    <pic:cNvPr id="1874212243" name="Picture 1874212243"/>
                     <pic:cNvPicPr/>
                   </pic:nvPicPr>
                   <pic:blipFill>
@@ -2965,7 +2996,7 @@
                   <pic:spPr>
                     <a:xfrm>
                       <a:off x="0" y="0"/>
-                      <a:ext cx="5731510" cy="2962910"/>
+                      <a:ext cx="5731510" cy="2831465"/>
                     </a:xfrm>
                     <a:prstGeom prst="rect">
                       <a:avLst/>
@@ -2996,102 +3027,6 @@
     </w:p>
     <w:p>
       <w:pPr>
-        <w:tabs>
-          <w:tab w:val="left" w:leader="dot" w:pos="8789"/>
-        </w:tabs>
-        <w:spacing w:after="0" w:line="360" w:lineRule="auto"/>
-        <w:rPr>
-          <w:b/>
-          <w:bCs/>
-          <w:noProof/>
-          <w:sz w:val="28"/>
-          <w:szCs w:val="28"/>
-          <w:lang w:val="en-US"/>
-        </w:rPr>
-      </w:pPr>
-    </w:p>
-    <w:p>
-      <w:pPr>
-        <w:tabs>
-          <w:tab w:val="left" w:leader="dot" w:pos="8789"/>
-        </w:tabs>
-        <w:spacing w:after="0" w:line="360" w:lineRule="auto"/>
-        <w:rPr>
-          <w:b/>
-          <w:bCs/>
-          <w:noProof/>
-          <w:sz w:val="28"/>
-          <w:szCs w:val="28"/>
-          <w:lang w:val="en-US"/>
-        </w:rPr>
-      </w:pPr>
-    </w:p>
-    <w:p>
-      <w:pPr>
-        <w:tabs>
-          <w:tab w:val="left" w:leader="dot" w:pos="8789"/>
-        </w:tabs>
-        <w:spacing w:after="0" w:line="360" w:lineRule="auto"/>
-        <w:rPr>
-          <w:b/>
-          <w:bCs/>
-          <w:noProof/>
-          <w:sz w:val="28"/>
-          <w:szCs w:val="28"/>
-          <w:lang w:val="en-US"/>
-        </w:rPr>
-      </w:pPr>
-    </w:p>
-    <w:p>
-      <w:pPr>
-        <w:tabs>
-          <w:tab w:val="left" w:leader="dot" w:pos="8789"/>
-        </w:tabs>
-        <w:spacing w:after="0" w:line="360" w:lineRule="auto"/>
-        <w:rPr>
-          <w:b/>
-          <w:bCs/>
-          <w:noProof/>
-          <w:sz w:val="28"/>
-          <w:szCs w:val="28"/>
-          <w:lang w:val="en-US"/>
-        </w:rPr>
-      </w:pPr>
-    </w:p>
-    <w:p>
-      <w:pPr>
-        <w:tabs>
-          <w:tab w:val="left" w:leader="dot" w:pos="8789"/>
-        </w:tabs>
-        <w:spacing w:after="0" w:line="360" w:lineRule="auto"/>
-        <w:rPr>
-          <w:b/>
-          <w:bCs/>
-          <w:noProof/>
-          <w:sz w:val="28"/>
-          <w:szCs w:val="28"/>
-          <w:lang w:val="en-US"/>
-        </w:rPr>
-      </w:pPr>
-    </w:p>
-    <w:p>
-      <w:pPr>
-        <w:tabs>
-          <w:tab w:val="left" w:leader="dot" w:pos="8789"/>
-        </w:tabs>
-        <w:spacing w:after="0" w:line="360" w:lineRule="auto"/>
-        <w:rPr>
-          <w:b/>
-          <w:bCs/>
-          <w:noProof/>
-          <w:sz w:val="28"/>
-          <w:szCs w:val="28"/>
-          <w:lang w:val="en-US"/>
-        </w:rPr>
-      </w:pPr>
-    </w:p>
-    <w:p>
-      <w:pPr>
         <w:pStyle w:val="ListParagraph"/>
         <w:numPr>
           <w:ilvl w:val="0"/>
@@ -3115,7 +3050,6 @@
           <w:noProof/>
           <w:lang w:val="en-US"/>
         </w:rPr>
-        <w:lastRenderedPageBreak/>
         <w:t xml:space="preserve">Terlebih dahulu, buat akun Admin terbaru untuk menghindari peretasan. </w:t>
       </w:r>
       <w:r>
@@ -3172,7 +3106,7 @@
           <w:lang w:val="en-US"/>
         </w:rPr>
         <w:drawing>
-          <wp:inline distT="0" distB="0" distL="0" distR="0" wp14:anchorId="3A807A95" wp14:editId="6955ED8F">
+          <wp:inline distT="0" distB="0" distL="0" distR="0" wp14:anchorId="3A807A95" wp14:editId="294CF99D">
             <wp:extent cx="5731510" cy="1180465"/>
             <wp:effectExtent l="0" t="0" r="2540" b="635"/>
             <wp:docPr id="298960207" name="Picture 35"/>
@@ -3216,6 +3150,38 @@
     </w:p>
     <w:p>
       <w:pPr>
+        <w:tabs>
+          <w:tab w:val="left" w:leader="dot" w:pos="8789"/>
+        </w:tabs>
+        <w:spacing w:after="0" w:line="360" w:lineRule="auto"/>
+        <w:rPr>
+          <w:b/>
+          <w:bCs/>
+          <w:noProof/>
+          <w:sz w:val="28"/>
+          <w:szCs w:val="28"/>
+          <w:lang w:val="en-US"/>
+        </w:rPr>
+      </w:pPr>
+    </w:p>
+    <w:p>
+      <w:pPr>
+        <w:tabs>
+          <w:tab w:val="left" w:leader="dot" w:pos="8789"/>
+        </w:tabs>
+        <w:spacing w:after="0" w:line="360" w:lineRule="auto"/>
+        <w:rPr>
+          <w:b/>
+          <w:bCs/>
+          <w:noProof/>
+          <w:sz w:val="28"/>
+          <w:szCs w:val="28"/>
+          <w:lang w:val="en-US"/>
+        </w:rPr>
+      </w:pPr>
+    </w:p>
+    <w:p>
+      <w:pPr>
         <w:pStyle w:val="ListParagraph"/>
         <w:numPr>
           <w:ilvl w:val="0"/>
@@ -3239,6 +3205,7 @@
           <w:noProof/>
           <w:lang w:val="en-US"/>
         </w:rPr>
+        <w:lastRenderedPageBreak/>
         <w:t xml:space="preserve">Isi data-data yang diperlukan, lalu klik </w:t>
       </w:r>
       <w:r>
@@ -3420,7 +3387,7 @@
           <w:lang w:val="en-US"/>
         </w:rPr>
         <w:drawing>
-          <wp:inline distT="0" distB="0" distL="0" distR="0" wp14:anchorId="2E688255" wp14:editId="4E95F146">
+          <wp:inline distT="0" distB="0" distL="0" distR="0" wp14:anchorId="2E688255" wp14:editId="7C1AC037">
             <wp:extent cx="5731510" cy="947420"/>
             <wp:effectExtent l="0" t="0" r="2540" b="5080"/>
             <wp:docPr id="1233700387" name="Picture 37"/>
@@ -3501,6 +3468,20 @@
     </w:p>
     <w:p>
       <w:pPr>
+        <w:tabs>
+          <w:tab w:val="left" w:leader="dot" w:pos="8789"/>
+        </w:tabs>
+        <w:spacing w:after="0" w:line="360" w:lineRule="auto"/>
+        <w:ind w:left="8789" w:hanging="8789"/>
+        <w:jc w:val="center"/>
+        <w:rPr>
+          <w:noProof/>
+          <w:lang w:val="en-US"/>
+        </w:rPr>
+      </w:pPr>
+    </w:p>
+    <w:p>
+      <w:pPr>
         <w:pStyle w:val="ListParagraph"/>
         <w:numPr>
           <w:ilvl w:val="0"/>
@@ -3524,33 +3505,116 @@
           <w:noProof/>
           <w:lang w:val="en-US"/>
         </w:rPr>
-        <w:t xml:space="preserve">Admin juga bisa membuat </w:t>
-      </w:r>
-      <w:r>
-        <w:rPr>
-          <w:noProof/>
-          <w:lang w:val="en-US"/>
-        </w:rPr>
-        <w:t>akun user (SDM) dan superuser</w:t>
-      </w:r>
-      <w:r>
-        <w:rPr>
-          <w:lang w:val="en-US"/>
-        </w:rPr>
-        <w:t xml:space="preserve"> (Kepala dan Direktur)</w:t>
-      </w:r>
-      <w:r>
-        <w:rPr>
-          <w:lang w:val="en-US"/>
-        </w:rPr>
-        <w:t xml:space="preserve"> dengan cara yang sama. Cukup mengisi jabatannya, hak akses akan otomatis terisi</w:t>
-      </w:r>
-      <w:r>
-        <w:rPr>
-          <w:lang w:val="en-US"/>
-        </w:rPr>
-        <w:t>.</w:t>
-      </w:r>
+        <w:t>Admin juga bisa membuat akun user (SDM) dan superuser</w:t>
+      </w:r>
+      <w:r>
+        <w:rPr>
+          <w:lang w:val="en-US"/>
+        </w:rPr>
+        <w:t xml:space="preserve"> (Kepala dan Direktur) dengan cara yang sama. Cukup mengisi jabatannya, hak akses akan otomatis terisi.</w:t>
+      </w:r>
+    </w:p>
+    <w:p>
+      <w:pPr>
+        <w:tabs>
+          <w:tab w:val="left" w:leader="dot" w:pos="8789"/>
+        </w:tabs>
+        <w:spacing w:after="0" w:line="360" w:lineRule="auto"/>
+        <w:ind w:left="360"/>
+        <w:rPr>
+          <w:b/>
+          <w:bCs/>
+          <w:noProof/>
+          <w:sz w:val="28"/>
+          <w:szCs w:val="28"/>
+          <w:lang w:val="en-US"/>
+        </w:rPr>
+      </w:pPr>
+    </w:p>
+    <w:p>
+      <w:pPr>
+        <w:tabs>
+          <w:tab w:val="left" w:leader="dot" w:pos="8789"/>
+        </w:tabs>
+        <w:spacing w:after="0" w:line="360" w:lineRule="auto"/>
+        <w:ind w:left="360"/>
+        <w:rPr>
+          <w:b/>
+          <w:bCs/>
+          <w:noProof/>
+          <w:sz w:val="28"/>
+          <w:szCs w:val="28"/>
+          <w:lang w:val="en-US"/>
+        </w:rPr>
+      </w:pPr>
+    </w:p>
+    <w:p>
+      <w:pPr>
+        <w:tabs>
+          <w:tab w:val="left" w:leader="dot" w:pos="8789"/>
+        </w:tabs>
+        <w:spacing w:after="0" w:line="360" w:lineRule="auto"/>
+        <w:ind w:left="360"/>
+        <w:rPr>
+          <w:b/>
+          <w:bCs/>
+          <w:noProof/>
+          <w:sz w:val="28"/>
+          <w:szCs w:val="28"/>
+          <w:lang w:val="en-US"/>
+        </w:rPr>
+      </w:pPr>
+    </w:p>
+    <w:p>
+      <w:pPr>
+        <w:tabs>
+          <w:tab w:val="left" w:leader="dot" w:pos="8789"/>
+        </w:tabs>
+        <w:spacing w:after="0" w:line="360" w:lineRule="auto"/>
+        <w:ind w:left="360"/>
+        <w:rPr>
+          <w:b/>
+          <w:bCs/>
+          <w:noProof/>
+          <w:sz w:val="28"/>
+          <w:szCs w:val="28"/>
+          <w:lang w:val="en-US"/>
+        </w:rPr>
+      </w:pPr>
+    </w:p>
+    <w:p>
+      <w:pPr>
+        <w:tabs>
+          <w:tab w:val="left" w:leader="dot" w:pos="8789"/>
+        </w:tabs>
+        <w:spacing w:after="0" w:line="360" w:lineRule="auto"/>
+        <w:ind w:left="360"/>
+        <w:rPr>
+          <w:b/>
+          <w:bCs/>
+          <w:noProof/>
+          <w:sz w:val="28"/>
+          <w:szCs w:val="28"/>
+          <w:lang w:val="en-US"/>
+        </w:rPr>
+      </w:pPr>
+    </w:p>
+    <w:p>
+      <w:pPr>
+        <w:tabs>
+          <w:tab w:val="left" w:leader="dot" w:pos="8789"/>
+        </w:tabs>
+        <w:spacing w:after="0" w:line="360" w:lineRule="auto"/>
+        <w:ind w:left="360"/>
+        <w:rPr>
+          <w:b/>
+          <w:bCs/>
+          <w:noProof/>
+          <w:sz w:val="28"/>
+          <w:szCs w:val="28"/>
+          <w:lang w:val="en-US"/>
+        </w:rPr>
+      </w:pPr>
     </w:p>
     <w:p>
       <w:pPr>
@@ -3584,7 +3648,6 @@
           <w:u w:val="single"/>
           <w:lang w:val="en-US"/>
         </w:rPr>
-        <w:lastRenderedPageBreak/>
         <w:t>CARA MENGISI DATA PEGAWAI (HAK KHUSUS ADMIN)</w:t>
       </w:r>
     </w:p>
@@ -3626,13 +3689,7 @@
         <w:rPr>
           <w:lang w:val="en-US"/>
         </w:rPr>
-        <w:t>. Lalu daftarkan data pegawai yang sesuai</w:t>
-      </w:r>
-      <w:r>
-        <w:rPr>
-          <w:lang w:val="en-US"/>
-        </w:rPr>
-        <w:t>.</w:t>
+        <w:t>. Lalu daftarkan data pegawai yang sesuai.</w:t>
       </w:r>
     </w:p>
     <w:p>
@@ -3661,7 +3718,7 @@
           <w:lang w:val="en-US"/>
         </w:rPr>
         <w:drawing>
-          <wp:inline distT="0" distB="0" distL="0" distR="0" wp14:anchorId="1554741E" wp14:editId="7DEDF6FC">
+          <wp:inline distT="0" distB="0" distL="0" distR="0" wp14:anchorId="1554741E" wp14:editId="684D64A3">
             <wp:extent cx="4600575" cy="1824225"/>
             <wp:effectExtent l="0" t="0" r="0" b="5080"/>
             <wp:docPr id="1965917370" name="Picture 2"/>
@@ -3729,7 +3786,7 @@
           <w:lang w:val="en-US"/>
         </w:rPr>
         <w:drawing>
-          <wp:inline distT="0" distB="0" distL="0" distR="0" wp14:anchorId="3373EE1B" wp14:editId="51672B1E">
+          <wp:inline distT="0" distB="0" distL="0" distR="0" wp14:anchorId="3373EE1B" wp14:editId="62015602">
             <wp:extent cx="4572000" cy="1797192"/>
             <wp:effectExtent l="0" t="0" r="0" b="0"/>
             <wp:docPr id="686161642" name="Picture 3"/>
@@ -3821,7 +3878,7 @@
           <w:noProof/>
           <w:lang w:val="en-US"/>
         </w:rPr>
-        <w:t>Form Pengajuan (HAK KHUSUS USER)</w:t>
+        <w:t>Form Pengajuan</w:t>
       </w:r>
     </w:p>
     <w:p>
@@ -3850,7 +3907,7 @@
           <w:lang w:val="en-US"/>
         </w:rPr>
         <w:drawing>
-          <wp:inline distT="0" distB="0" distL="0" distR="0" wp14:anchorId="6534927E" wp14:editId="0A39405F">
+          <wp:inline distT="0" distB="0" distL="0" distR="0" wp14:anchorId="6534927E" wp14:editId="25FC7AD7">
             <wp:extent cx="4295775" cy="1764761"/>
             <wp:effectExtent l="0" t="0" r="0" b="6985"/>
             <wp:docPr id="142823627" name="Picture 4"/>
@@ -3917,11 +3974,18 @@
           <w:szCs w:val="28"/>
           <w:lang w:val="en-US"/>
         </w:rPr>
-        <w:lastRenderedPageBreak/>
         <w:drawing>
-          <wp:inline distT="0" distB="0" distL="0" distR="0" wp14:anchorId="32E28AC8" wp14:editId="26DD1347">
-            <wp:extent cx="4200525" cy="1985010"/>
+          <wp:anchor distT="0" distB="0" distL="114300" distR="114300" simplePos="0" relativeHeight="251658240" behindDoc="1" locked="0" layoutInCell="1" allowOverlap="1" wp14:anchorId="32E28AC8" wp14:editId="42B49D1F">
+            <wp:simplePos x="0" y="0"/>
+            <wp:positionH relativeFrom="margin">
+              <wp:align>center</wp:align>
+            </wp:positionH>
+            <wp:positionV relativeFrom="paragraph">
+              <wp:posOffset>13335</wp:posOffset>
+            </wp:positionV>
+            <wp:extent cx="4124325" cy="1948815"/>
             <wp:effectExtent l="0" t="0" r="9525" b="0"/>
+            <wp:wrapNone/>
             <wp:docPr id="1010271662" name="Picture 5"/>
             <wp:cNvGraphicFramePr>
               <a:graphicFrameLocks xmlns:a="http://schemas.openxmlformats.org/drawingml/2006/main" noChangeAspect="1"/>
@@ -3948,7 +4012,7 @@
                   <pic:spPr>
                     <a:xfrm>
                       <a:off x="0" y="0"/>
-                      <a:ext cx="4222150" cy="1995229"/>
+                      <a:ext cx="4124325" cy="1948815"/>
                     </a:xfrm>
                     <a:prstGeom prst="rect">
                       <a:avLst/>
@@ -3957,9 +4021,66 @@
                 </pic:pic>
               </a:graphicData>
             </a:graphic>
-          </wp:inline>
+            <wp14:sizeRelH relativeFrom="page">
+              <wp14:pctWidth>0</wp14:pctWidth>
+            </wp14:sizeRelH>
+            <wp14:sizeRelV relativeFrom="page">
+              <wp14:pctHeight>0</wp14:pctHeight>
+            </wp14:sizeRelV>
+          </wp:anchor>
         </w:drawing>
       </w:r>
+    </w:p>
+    <w:p>
+      <w:pPr>
+        <w:tabs>
+          <w:tab w:val="left" w:leader="dot" w:pos="8789"/>
+        </w:tabs>
+        <w:spacing w:after="0" w:line="360" w:lineRule="auto"/>
+        <w:jc w:val="center"/>
+        <w:rPr>
+          <w:b/>
+          <w:bCs/>
+          <w:noProof/>
+          <w:sz w:val="28"/>
+          <w:szCs w:val="28"/>
+          <w:lang w:val="en-US"/>
+        </w:rPr>
+      </w:pPr>
+    </w:p>
+    <w:p>
+      <w:pPr>
+        <w:tabs>
+          <w:tab w:val="left" w:leader="dot" w:pos="8789"/>
+        </w:tabs>
+        <w:spacing w:after="0" w:line="360" w:lineRule="auto"/>
+        <w:jc w:val="center"/>
+        <w:rPr>
+          <w:b/>
+          <w:bCs/>
+          <w:noProof/>
+          <w:sz w:val="28"/>
+          <w:szCs w:val="28"/>
+          <w:lang w:val="en-US"/>
+        </w:rPr>
+      </w:pPr>
+    </w:p>
+    <w:p>
+      <w:pPr>
+        <w:tabs>
+          <w:tab w:val="left" w:leader="dot" w:pos="8789"/>
+        </w:tabs>
+        <w:spacing w:after="0" w:line="360" w:lineRule="auto"/>
+        <w:jc w:val="center"/>
+        <w:rPr>
+          <w:b/>
+          <w:bCs/>
+          <w:noProof/>
+          <w:sz w:val="28"/>
+          <w:szCs w:val="28"/>
+          <w:lang w:val="en-US"/>
+        </w:rPr>
+      </w:pPr>
     </w:p>
     <w:p>
       <w:pPr>
@@ -4010,7 +4131,8 @@
           <w:u w:val="single"/>
           <w:lang w:val="en-US"/>
         </w:rPr>
-        <w:t>MELAKUKAN PENGAJUAN CUTI (HAK KHUSUS USER SDM)</w:t>
+        <w:lastRenderedPageBreak/>
+        <w:t>MELAKUKAN PENGAJUAN CUTI</w:t>
       </w:r>
     </w:p>
     <w:p>
@@ -4122,7 +4244,7 @@
           <w:lang w:val="en-US"/>
         </w:rPr>
         <w:drawing>
-          <wp:inline distT="0" distB="0" distL="0" distR="0" wp14:anchorId="5C7D6E34" wp14:editId="6AE3A3B3">
+          <wp:inline distT="0" distB="0" distL="0" distR="0" wp14:anchorId="5C7D6E34" wp14:editId="6A470C6D">
             <wp:extent cx="5076825" cy="2713339"/>
             <wp:effectExtent l="0" t="0" r="0" b="0"/>
             <wp:docPr id="1349405726" name="Picture 7"/>
@@ -4190,7 +4312,7 @@
           <w:lang w:val="en-US"/>
         </w:rPr>
         <w:drawing>
-          <wp:inline distT="0" distB="0" distL="0" distR="0" wp14:anchorId="4897C923" wp14:editId="0EBFB085">
+          <wp:inline distT="0" distB="0" distL="0" distR="0" wp14:anchorId="4897C923" wp14:editId="0BB9999E">
             <wp:extent cx="5114925" cy="2733701"/>
             <wp:effectExtent l="0" t="0" r="0" b="9525"/>
             <wp:docPr id="694604100" name="Picture 8"/>
@@ -4259,7 +4381,6 @@
           <w:noProof/>
           <w:lang w:val="en-US"/>
         </w:rPr>
-        <w:lastRenderedPageBreak/>
         <w:t xml:space="preserve">Form </w:t>
       </w:r>
       <w:r>
@@ -4320,7 +4441,7 @@
           <w:lang w:val="en-US"/>
         </w:rPr>
         <w:drawing>
-          <wp:inline distT="0" distB="0" distL="0" distR="0" wp14:anchorId="2C6ED271" wp14:editId="51177F04">
+          <wp:inline distT="0" distB="0" distL="0" distR="0" wp14:anchorId="2C6ED271" wp14:editId="0713553C">
             <wp:extent cx="5731510" cy="1116330"/>
             <wp:effectExtent l="0" t="0" r="2540" b="7620"/>
             <wp:docPr id="302121946" name="Picture 9"/>
@@ -4364,6 +4485,38 @@
     </w:p>
     <w:p>
       <w:pPr>
+        <w:tabs>
+          <w:tab w:val="left" w:leader="dot" w:pos="8789"/>
+        </w:tabs>
+        <w:spacing w:after="0" w:line="360" w:lineRule="auto"/>
+        <w:rPr>
+          <w:b/>
+          <w:bCs/>
+          <w:noProof/>
+          <w:sz w:val="28"/>
+          <w:szCs w:val="28"/>
+          <w:lang w:val="en-US"/>
+        </w:rPr>
+      </w:pPr>
+    </w:p>
+    <w:p>
+      <w:pPr>
+        <w:tabs>
+          <w:tab w:val="left" w:leader="dot" w:pos="8789"/>
+        </w:tabs>
+        <w:spacing w:after="0" w:line="360" w:lineRule="auto"/>
+        <w:rPr>
+          <w:b/>
+          <w:bCs/>
+          <w:noProof/>
+          <w:sz w:val="28"/>
+          <w:szCs w:val="28"/>
+          <w:lang w:val="en-US"/>
+        </w:rPr>
+      </w:pPr>
+    </w:p>
+    <w:p>
+      <w:pPr>
         <w:pStyle w:val="ListParagraph"/>
         <w:numPr>
           <w:ilvl w:val="0"/>
@@ -4387,6 +4540,7 @@
           <w:noProof/>
           <w:lang w:val="en-US"/>
         </w:rPr>
+        <w:lastRenderedPageBreak/>
         <w:t>Hak khusus yang hanya dimiliki SDM juga adalah dapat men-download semua data tabel pegawai, tabel pengajuan, tabel diterima, dan tabel ditolak.</w:t>
       </w:r>
     </w:p>
@@ -4416,7 +4570,7 @@
           <w:lang w:val="en-US"/>
         </w:rPr>
         <w:drawing>
-          <wp:inline distT="0" distB="0" distL="0" distR="0" wp14:anchorId="5AC5CBC7" wp14:editId="17740F10">
+          <wp:inline distT="0" distB="0" distL="0" distR="0" wp14:anchorId="5AC5CBC7" wp14:editId="48873BF1">
             <wp:extent cx="5731510" cy="848995"/>
             <wp:effectExtent l="0" t="0" r="2540" b="8255"/>
             <wp:docPr id="1658693441" name="Picture 10"/>
@@ -4484,7 +4638,7 @@
           <w:lang w:val="en-US"/>
         </w:rPr>
         <w:drawing>
-          <wp:inline distT="0" distB="0" distL="0" distR="0" wp14:anchorId="698828E5" wp14:editId="76C7ACB3">
+          <wp:inline distT="0" distB="0" distL="0" distR="0" wp14:anchorId="698828E5" wp14:editId="580164DC">
             <wp:extent cx="5731510" cy="814705"/>
             <wp:effectExtent l="0" t="0" r="2540" b="4445"/>
             <wp:docPr id="349190715" name="Picture 11"/>
@@ -4552,7 +4706,7 @@
           <w:lang w:val="en-US"/>
         </w:rPr>
         <w:drawing>
-          <wp:inline distT="0" distB="0" distL="0" distR="0" wp14:anchorId="13FC7B6A" wp14:editId="613A0C6B">
+          <wp:inline distT="0" distB="0" distL="0" distR="0" wp14:anchorId="13FC7B6A" wp14:editId="61CB86DB">
             <wp:extent cx="5731510" cy="829945"/>
             <wp:effectExtent l="0" t="0" r="2540" b="8255"/>
             <wp:docPr id="2085319691" name="Picture 12"/>
@@ -4620,7 +4774,7 @@
           <w:lang w:val="en-US"/>
         </w:rPr>
         <w:drawing>
-          <wp:inline distT="0" distB="0" distL="0" distR="0" wp14:anchorId="683901A8" wp14:editId="681C8A30">
+          <wp:inline distT="0" distB="0" distL="0" distR="0" wp14:anchorId="683901A8" wp14:editId="29489D69">
             <wp:extent cx="5731510" cy="1116965"/>
             <wp:effectExtent l="0" t="0" r="2540" b="6985"/>
             <wp:docPr id="43239032" name="Picture 13"/>
@@ -4681,125 +4835,6 @@
     </w:p>
     <w:p>
       <w:pPr>
-        <w:tabs>
-          <w:tab w:val="left" w:leader="dot" w:pos="8789"/>
-        </w:tabs>
-        <w:spacing w:after="0" w:line="360" w:lineRule="auto"/>
-        <w:jc w:val="center"/>
-        <w:rPr>
-          <w:b/>
-          <w:bCs/>
-          <w:noProof/>
-          <w:sz w:val="28"/>
-          <w:szCs w:val="28"/>
-          <w:lang w:val="en-US"/>
-        </w:rPr>
-      </w:pPr>
-    </w:p>
-    <w:p>
-      <w:pPr>
-        <w:tabs>
-          <w:tab w:val="left" w:leader="dot" w:pos="8789"/>
-        </w:tabs>
-        <w:spacing w:after="0" w:line="360" w:lineRule="auto"/>
-        <w:jc w:val="center"/>
-        <w:rPr>
-          <w:b/>
-          <w:bCs/>
-          <w:noProof/>
-          <w:sz w:val="28"/>
-          <w:szCs w:val="28"/>
-          <w:lang w:val="en-US"/>
-        </w:rPr>
-      </w:pPr>
-    </w:p>
-    <w:p>
-      <w:pPr>
-        <w:tabs>
-          <w:tab w:val="left" w:leader="dot" w:pos="8789"/>
-        </w:tabs>
-        <w:spacing w:after="0" w:line="360" w:lineRule="auto"/>
-        <w:jc w:val="center"/>
-        <w:rPr>
-          <w:b/>
-          <w:bCs/>
-          <w:noProof/>
-          <w:sz w:val="28"/>
-          <w:szCs w:val="28"/>
-          <w:lang w:val="en-US"/>
-        </w:rPr>
-      </w:pPr>
-    </w:p>
-    <w:p>
-      <w:pPr>
-        <w:tabs>
-          <w:tab w:val="left" w:leader="dot" w:pos="8789"/>
-        </w:tabs>
-        <w:spacing w:after="0" w:line="360" w:lineRule="auto"/>
-        <w:jc w:val="center"/>
-        <w:rPr>
-          <w:b/>
-          <w:bCs/>
-          <w:noProof/>
-          <w:sz w:val="28"/>
-          <w:szCs w:val="28"/>
-          <w:lang w:val="en-US"/>
-        </w:rPr>
-      </w:pPr>
-    </w:p>
-    <w:p>
-      <w:pPr>
-        <w:tabs>
-          <w:tab w:val="left" w:leader="dot" w:pos="8789"/>
-        </w:tabs>
-        <w:spacing w:after="0" w:line="360" w:lineRule="auto"/>
-        <w:jc w:val="center"/>
-        <w:rPr>
-          <w:b/>
-          <w:bCs/>
-          <w:noProof/>
-          <w:sz w:val="28"/>
-          <w:szCs w:val="28"/>
-          <w:lang w:val="en-US"/>
-        </w:rPr>
-      </w:pPr>
-    </w:p>
-    <w:p>
-      <w:pPr>
-        <w:tabs>
-          <w:tab w:val="left" w:leader="dot" w:pos="8789"/>
-        </w:tabs>
-        <w:spacing w:after="0" w:line="360" w:lineRule="auto"/>
-        <w:jc w:val="center"/>
-        <w:rPr>
-          <w:b/>
-          <w:bCs/>
-          <w:noProof/>
-          <w:sz w:val="28"/>
-          <w:szCs w:val="28"/>
-          <w:lang w:val="en-US"/>
-        </w:rPr>
-      </w:pPr>
-    </w:p>
-    <w:p>
-      <w:pPr>
-        <w:tabs>
-          <w:tab w:val="left" w:leader="dot" w:pos="8789"/>
-        </w:tabs>
-        <w:spacing w:after="0" w:line="360" w:lineRule="auto"/>
-        <w:jc w:val="center"/>
-        <w:rPr>
-          <w:b/>
-          <w:bCs/>
-          <w:noProof/>
-          <w:sz w:val="28"/>
-          <w:szCs w:val="28"/>
-          <w:lang w:val="en-US"/>
-        </w:rPr>
-      </w:pPr>
-    </w:p>
-    <w:p>
-      <w:pPr>
         <w:pStyle w:val="ListParagraph"/>
         <w:numPr>
           <w:ilvl w:val="0"/>
@@ -4829,8 +4864,79 @@
           <w:u w:val="single"/>
           <w:lang w:val="en-US"/>
         </w:rPr>
-        <w:lastRenderedPageBreak/>
-        <w:t>MERESPON PENGAJUAN CUTI (HAK KHUSUS SUPERUSER KEPALA RRI DAN DIREKTUR RRI)</w:t>
+        <w:t xml:space="preserve">MERESPON PENGAJUAN CUTI </w:t>
+      </w:r>
+      <w:r>
+        <w:rPr>
+          <w:b/>
+          <w:bCs/>
+          <w:noProof/>
+          <w:sz w:val="32"/>
+          <w:szCs w:val="32"/>
+          <w:u w:val="single"/>
+          <w:lang w:val="en-US"/>
+        </w:rPr>
+        <w:t>(</w:t>
+      </w:r>
+      <w:r>
+        <w:rPr>
+          <w:b/>
+          <w:bCs/>
+          <w:noProof/>
+          <w:sz w:val="32"/>
+          <w:szCs w:val="32"/>
+          <w:u w:val="single"/>
+          <w:lang w:val="en-US"/>
+        </w:rPr>
+        <w:t xml:space="preserve">Hak Khusus Superuser Kepala </w:t>
+      </w:r>
+      <w:r>
+        <w:rPr>
+          <w:b/>
+          <w:bCs/>
+          <w:noProof/>
+          <w:sz w:val="32"/>
+          <w:szCs w:val="32"/>
+          <w:u w:val="single"/>
+          <w:lang w:val="en-US"/>
+        </w:rPr>
+        <w:t>RRI</w:t>
+      </w:r>
+      <w:r>
+        <w:rPr>
+          <w:b/>
+          <w:bCs/>
+          <w:noProof/>
+          <w:sz w:val="32"/>
+          <w:szCs w:val="32"/>
+          <w:u w:val="single"/>
+          <w:lang w:val="en-US"/>
+        </w:rPr>
+        <w:t xml:space="preserve"> Dan Direktur </w:t>
+      </w:r>
+      <w:r>
+        <w:rPr>
+          <w:b/>
+          <w:bCs/>
+          <w:noProof/>
+          <w:sz w:val="32"/>
+          <w:szCs w:val="32"/>
+          <w:u w:val="single"/>
+          <w:lang w:val="en-US"/>
+        </w:rPr>
+        <w:t>RRI</w:t>
+      </w:r>
+      <w:r>
+        <w:rPr>
+          <w:b/>
+          <w:bCs/>
+          <w:noProof/>
+          <w:sz w:val="32"/>
+          <w:szCs w:val="32"/>
+          <w:u w:val="single"/>
+          <w:lang w:val="en-US"/>
+        </w:rPr>
+        <w:t>)</w:t>
       </w:r>
     </w:p>
     <w:p>
@@ -4990,7 +5096,7 @@
           <w:lang w:val="en-US"/>
         </w:rPr>
         <w:drawing>
-          <wp:inline distT="0" distB="0" distL="0" distR="0" wp14:anchorId="625C5465" wp14:editId="3C10BE38">
+          <wp:inline distT="0" distB="0" distL="0" distR="0" wp14:anchorId="625C5465" wp14:editId="2E73BDE4">
             <wp:extent cx="5731510" cy="1818005"/>
             <wp:effectExtent l="0" t="0" r="2540" b="0"/>
             <wp:docPr id="1365393052" name="Picture 14"/>
@@ -5034,6 +5140,38 @@
     </w:p>
     <w:p>
       <w:pPr>
+        <w:tabs>
+          <w:tab w:val="left" w:leader="dot" w:pos="8789"/>
+        </w:tabs>
+        <w:spacing w:after="0" w:line="360" w:lineRule="auto"/>
+        <w:rPr>
+          <w:b/>
+          <w:bCs/>
+          <w:noProof/>
+          <w:sz w:val="28"/>
+          <w:szCs w:val="28"/>
+          <w:lang w:val="en-US"/>
+        </w:rPr>
+      </w:pPr>
+    </w:p>
+    <w:p>
+      <w:pPr>
+        <w:tabs>
+          <w:tab w:val="left" w:leader="dot" w:pos="8789"/>
+        </w:tabs>
+        <w:spacing w:after="0" w:line="360" w:lineRule="auto"/>
+        <w:rPr>
+          <w:b/>
+          <w:bCs/>
+          <w:noProof/>
+          <w:sz w:val="28"/>
+          <w:szCs w:val="28"/>
+          <w:lang w:val="en-US"/>
+        </w:rPr>
+      </w:pPr>
+    </w:p>
+    <w:p>
+      <w:pPr>
         <w:pStyle w:val="ListParagraph"/>
         <w:numPr>
           <w:ilvl w:val="0"/>
@@ -5057,6 +5195,39 @@
           <w:noProof/>
           <w:lang w:val="en-US"/>
         </w:rPr>
+        <w:lastRenderedPageBreak/>
+        <w:t xml:space="preserve">Pilih file blanko respon yang sesuai lalu klik tombol respon yang sesuai. Pengajuan tersebut </w:t>
+      </w:r>
+      <w:r>
+        <w:rPr>
+          <w:b/>
+          <w:bCs/>
+          <w:noProof/>
+          <w:lang w:val="en-US"/>
+        </w:rPr>
+        <w:t>diterima</w:t>
+      </w:r>
+      <w:r>
+        <w:rPr>
+          <w:noProof/>
+          <w:lang w:val="en-US"/>
+        </w:rPr>
+        <w:t xml:space="preserve"> atau </w:t>
+      </w:r>
+      <w:r>
+        <w:rPr>
+          <w:b/>
+          <w:bCs/>
+          <w:noProof/>
+          <w:lang w:val="en-US"/>
+        </w:rPr>
+        <w:t>ditolak</w:t>
+      </w:r>
+      <w:r>
+        <w:rPr>
+          <w:noProof/>
+          <w:lang w:val="en-US"/>
+        </w:rPr>
         <w:t>.</w:t>
       </w:r>
     </w:p>
@@ -5066,18 +5237,447 @@
           <w:tab w:val="left" w:leader="dot" w:pos="8789"/>
         </w:tabs>
         <w:spacing w:after="0" w:line="360" w:lineRule="auto"/>
+        <w:rPr>
+          <w:b/>
+          <w:bCs/>
+          <w:noProof/>
+          <w:sz w:val="28"/>
+          <w:szCs w:val="28"/>
+          <w:lang w:val="en-US"/>
+        </w:rPr>
+      </w:pPr>
+      <w:r>
+        <w:rPr>
+          <w:b/>
+          <w:bCs/>
+          <w:noProof/>
+          <w:sz w:val="28"/>
+          <w:szCs w:val="28"/>
+          <w:lang w:val="en-US"/>
+        </w:rPr>
+        <w:drawing>
+          <wp:inline distT="0" distB="0" distL="0" distR="0" wp14:anchorId="6A6EE0E9" wp14:editId="112FCF7D">
+            <wp:extent cx="5731510" cy="1741170"/>
+            <wp:effectExtent l="0" t="0" r="2540" b="0"/>
+            <wp:docPr id="429505762" name="Picture 3"/>
+            <wp:cNvGraphicFramePr>
+              <a:graphicFrameLocks xmlns:a="http://schemas.openxmlformats.org/drawingml/2006/main" noChangeAspect="1"/>
+            </wp:cNvGraphicFramePr>
+            <a:graphic xmlns:a="http://schemas.openxmlformats.org/drawingml/2006/main">
+              <a:graphicData uri="http://schemas.openxmlformats.org/drawingml/2006/picture">
+                <pic:pic xmlns:pic="http://schemas.openxmlformats.org/drawingml/2006/picture">
+                  <pic:nvPicPr>
+                    <pic:cNvPr id="429505762" name="Picture 429505762"/>
+                    <pic:cNvPicPr/>
+                  </pic:nvPicPr>
+                  <pic:blipFill>
+                    <a:blip r:embed="rId46" cstate="print">
+                      <a:extLst>
+                        <a:ext uri="{28A0092B-C50C-407E-A947-70E740481C1C}">
+                          <a14:useLocalDpi xmlns:a14="http://schemas.microsoft.com/office/drawing/2010/main" val="0"/>
+                        </a:ext>
+                      </a:extLst>
+                    </a:blip>
+                    <a:stretch>
+                      <a:fillRect/>
+                    </a:stretch>
+                  </pic:blipFill>
+                  <pic:spPr>
+                    <a:xfrm>
+                      <a:off x="0" y="0"/>
+                      <a:ext cx="5731510" cy="1741170"/>
+                    </a:xfrm>
+                    <a:prstGeom prst="rect">
+                      <a:avLst/>
+                    </a:prstGeom>
+                  </pic:spPr>
+                </pic:pic>
+              </a:graphicData>
+            </a:graphic>
+          </wp:inline>
+        </w:drawing>
+      </w:r>
+    </w:p>
+    <w:p>
+      <w:pPr>
+        <w:pStyle w:val="ListParagraph"/>
+        <w:numPr>
+          <w:ilvl w:val="0"/>
+          <w:numId w:val="8"/>
+        </w:numPr>
+        <w:tabs>
+          <w:tab w:val="left" w:leader="dot" w:pos="8789"/>
+        </w:tabs>
+        <w:spacing w:after="0" w:line="360" w:lineRule="auto"/>
+        <w:rPr>
+          <w:b/>
+          <w:bCs/>
+          <w:noProof/>
+          <w:sz w:val="28"/>
+          <w:szCs w:val="28"/>
+          <w:lang w:val="en-US"/>
+        </w:rPr>
+      </w:pPr>
+      <w:r>
+        <w:rPr>
+          <w:noProof/>
+          <w:lang w:val="en-US"/>
+        </w:rPr>
+        <w:t>Setelah dikirim, akan muncul pop-up dibawah (terkadang tidak muncul dikarenakan browser itu sendiri)</w:t>
+      </w:r>
+    </w:p>
+    <w:p>
+      <w:pPr>
+        <w:tabs>
+          <w:tab w:val="left" w:leader="dot" w:pos="8789"/>
+        </w:tabs>
+        <w:spacing w:after="0" w:line="360" w:lineRule="auto"/>
         <w:jc w:val="center"/>
         <w:rPr>
           <w:b/>
           <w:bCs/>
           <w:noProof/>
-          <w:lang w:val="en-US"/>
-        </w:rPr>
-      </w:pPr>
-      <w:r>
-        <w:rPr>
-          <w:b/>
-          <w:bCs/>
+          <w:sz w:val="28"/>
+          <w:szCs w:val="28"/>
+          <w:lang w:val="en-US"/>
+        </w:rPr>
+      </w:pPr>
+      <w:r>
+        <w:rPr>
+          <w:b/>
+          <w:bCs/>
+          <w:noProof/>
+          <w:sz w:val="28"/>
+          <w:szCs w:val="28"/>
+          <w:lang w:val="en-US"/>
+        </w:rPr>
+        <w:drawing>
+          <wp:inline distT="0" distB="0" distL="0" distR="0" wp14:anchorId="2A57AEF0" wp14:editId="5078AD50">
+            <wp:extent cx="2590800" cy="859418"/>
+            <wp:effectExtent l="0" t="0" r="0" b="0"/>
+            <wp:docPr id="1365297705" name="Picture 4"/>
+            <wp:cNvGraphicFramePr>
+              <a:graphicFrameLocks xmlns:a="http://schemas.openxmlformats.org/drawingml/2006/main" noChangeAspect="1"/>
+            </wp:cNvGraphicFramePr>
+            <a:graphic xmlns:a="http://schemas.openxmlformats.org/drawingml/2006/main">
+              <a:graphicData uri="http://schemas.openxmlformats.org/drawingml/2006/picture">
+                <pic:pic xmlns:pic="http://schemas.openxmlformats.org/drawingml/2006/picture">
+                  <pic:nvPicPr>
+                    <pic:cNvPr id="1365297705" name="Picture 1365297705"/>
+                    <pic:cNvPicPr/>
+                  </pic:nvPicPr>
+                  <pic:blipFill>
+                    <a:blip r:embed="rId47">
+                      <a:extLst>
+                        <a:ext uri="{28A0092B-C50C-407E-A947-70E740481C1C}">
+                          <a14:useLocalDpi xmlns:a14="http://schemas.microsoft.com/office/drawing/2010/main" val="0"/>
+                        </a:ext>
+                      </a:extLst>
+                    </a:blip>
+                    <a:stretch>
+                      <a:fillRect/>
+                    </a:stretch>
+                  </pic:blipFill>
+                  <pic:spPr>
+                    <a:xfrm>
+                      <a:off x="0" y="0"/>
+                      <a:ext cx="2600305" cy="862571"/>
+                    </a:xfrm>
+                    <a:prstGeom prst="rect">
+                      <a:avLst/>
+                    </a:prstGeom>
+                  </pic:spPr>
+                </pic:pic>
+              </a:graphicData>
+            </a:graphic>
+          </wp:inline>
+        </w:drawing>
+      </w:r>
+    </w:p>
+    <w:p>
+      <w:pPr>
+        <w:pStyle w:val="ListParagraph"/>
+        <w:numPr>
+          <w:ilvl w:val="0"/>
+          <w:numId w:val="8"/>
+        </w:numPr>
+        <w:tabs>
+          <w:tab w:val="left" w:leader="dot" w:pos="8789"/>
+        </w:tabs>
+        <w:spacing w:after="0" w:line="360" w:lineRule="auto"/>
+        <w:rPr>
+          <w:b/>
+          <w:bCs/>
+          <w:noProof/>
+          <w:sz w:val="28"/>
+          <w:szCs w:val="28"/>
+          <w:lang w:val="en-US"/>
+        </w:rPr>
+      </w:pPr>
+      <w:r>
+        <w:rPr>
+          <w:noProof/>
+          <w:lang w:val="en-US"/>
+        </w:rPr>
+        <w:t xml:space="preserve">Setelah berhasil, pengajuan tersebut akan dipindahkan ke halaman </w:t>
+      </w:r>
+      <w:r>
+        <w:rPr>
+          <w:b/>
+          <w:bCs/>
+          <w:noProof/>
+          <w:lang w:val="en-US"/>
+        </w:rPr>
+        <w:t>cuti diterima</w:t>
+      </w:r>
+      <w:r>
+        <w:rPr>
+          <w:noProof/>
+          <w:lang w:val="en-US"/>
+        </w:rPr>
+        <w:t xml:space="preserve"> (jika diterima) atau </w:t>
+      </w:r>
+      <w:r>
+        <w:rPr>
+          <w:b/>
+          <w:bCs/>
+          <w:noProof/>
+          <w:lang w:val="en-US"/>
+        </w:rPr>
+        <w:t>cuti ditolak</w:t>
+      </w:r>
+      <w:r>
+        <w:rPr>
+          <w:noProof/>
+          <w:lang w:val="en-US"/>
+        </w:rPr>
+        <w:t xml:space="preserve"> (jika ditolak).</w:t>
+      </w:r>
+    </w:p>
+    <w:p>
+      <w:pPr>
+        <w:tabs>
+          <w:tab w:val="left" w:leader="dot" w:pos="8789"/>
+        </w:tabs>
+        <w:spacing w:after="0" w:line="360" w:lineRule="auto"/>
+        <w:jc w:val="center"/>
+        <w:rPr>
+          <w:b/>
+          <w:bCs/>
+          <w:noProof/>
+          <w:sz w:val="28"/>
+          <w:szCs w:val="28"/>
+          <w:lang w:val="en-US"/>
+        </w:rPr>
+      </w:pPr>
+      <w:r>
+        <w:rPr>
+          <w:b/>
+          <w:bCs/>
+          <w:noProof/>
+          <w:sz w:val="28"/>
+          <w:szCs w:val="28"/>
+          <w:lang w:val="en-US"/>
+        </w:rPr>
+        <w:drawing>
+          <wp:inline distT="0" distB="0" distL="0" distR="0" wp14:anchorId="7B3128B4" wp14:editId="259EE00F">
+            <wp:extent cx="4914900" cy="1497449"/>
+            <wp:effectExtent l="0" t="0" r="0" b="7620"/>
+            <wp:docPr id="1234507756" name="Picture 5"/>
+            <wp:cNvGraphicFramePr>
+              <a:graphicFrameLocks xmlns:a="http://schemas.openxmlformats.org/drawingml/2006/main" noChangeAspect="1"/>
+            </wp:cNvGraphicFramePr>
+            <a:graphic xmlns:a="http://schemas.openxmlformats.org/drawingml/2006/main">
+              <a:graphicData uri="http://schemas.openxmlformats.org/drawingml/2006/picture">
+                <pic:pic xmlns:pic="http://schemas.openxmlformats.org/drawingml/2006/picture">
+                  <pic:nvPicPr>
+                    <pic:cNvPr id="1234507756" name="Picture 1234507756"/>
+                    <pic:cNvPicPr/>
+                  </pic:nvPicPr>
+                  <pic:blipFill>
+                    <a:blip r:embed="rId48" cstate="print">
+                      <a:extLst>
+                        <a:ext uri="{28A0092B-C50C-407E-A947-70E740481C1C}">
+                          <a14:useLocalDpi xmlns:a14="http://schemas.microsoft.com/office/drawing/2010/main" val="0"/>
+                        </a:ext>
+                      </a:extLst>
+                    </a:blip>
+                    <a:stretch>
+                      <a:fillRect/>
+                    </a:stretch>
+                  </pic:blipFill>
+                  <pic:spPr>
+                    <a:xfrm>
+                      <a:off x="0" y="0"/>
+                      <a:ext cx="4922121" cy="1499649"/>
+                    </a:xfrm>
+                    <a:prstGeom prst="rect">
+                      <a:avLst/>
+                    </a:prstGeom>
+                  </pic:spPr>
+                </pic:pic>
+              </a:graphicData>
+            </a:graphic>
+          </wp:inline>
+        </w:drawing>
+      </w:r>
+    </w:p>
+    <w:p>
+      <w:pPr>
+        <w:tabs>
+          <w:tab w:val="left" w:leader="dot" w:pos="8789"/>
+        </w:tabs>
+        <w:spacing w:after="0" w:line="360" w:lineRule="auto"/>
+        <w:rPr>
+          <w:b/>
+          <w:bCs/>
+          <w:noProof/>
+          <w:sz w:val="28"/>
+          <w:szCs w:val="28"/>
+          <w:lang w:val="en-US"/>
+        </w:rPr>
+      </w:pPr>
+    </w:p>
+    <w:p>
+      <w:pPr>
+        <w:pStyle w:val="ListParagraph"/>
+        <w:numPr>
+          <w:ilvl w:val="0"/>
+          <w:numId w:val="1"/>
+        </w:numPr>
+        <w:tabs>
+          <w:tab w:val="left" w:leader="dot" w:pos="8789"/>
+        </w:tabs>
+        <w:spacing w:after="0" w:line="360" w:lineRule="auto"/>
+        <w:ind w:left="0" w:hanging="567"/>
+        <w:rPr>
+          <w:b/>
+          <w:bCs/>
+          <w:noProof/>
+          <w:sz w:val="32"/>
+          <w:szCs w:val="32"/>
+          <w:u w:val="single"/>
+          <w:lang w:val="en-US"/>
+        </w:rPr>
+      </w:pPr>
+      <w:r>
+        <w:rPr>
+          <w:b/>
+          <w:bCs/>
+          <w:noProof/>
+          <w:sz w:val="32"/>
+          <w:szCs w:val="32"/>
+          <w:u w:val="single"/>
+          <w:lang w:val="en-US"/>
+        </w:rPr>
+        <w:t xml:space="preserve">TUGAS </w:t>
+      </w:r>
+      <w:r>
+        <w:rPr>
+          <w:b/>
+          <w:bCs/>
+          <w:noProof/>
+          <w:sz w:val="32"/>
+          <w:szCs w:val="32"/>
+          <w:u w:val="single"/>
+          <w:lang w:val="en-US"/>
+        </w:rPr>
+        <w:t>SDM DAN HAK KHUSUS SDM</w:t>
+      </w:r>
+    </w:p>
+    <w:p>
+      <w:pPr>
+        <w:pStyle w:val="ListParagraph"/>
+        <w:numPr>
+          <w:ilvl w:val="0"/>
+          <w:numId w:val="9"/>
+        </w:numPr>
+        <w:tabs>
+          <w:tab w:val="left" w:leader="dot" w:pos="8789"/>
+        </w:tabs>
+        <w:spacing w:after="0" w:line="360" w:lineRule="auto"/>
+        <w:rPr>
+          <w:b/>
+          <w:bCs/>
+          <w:noProof/>
+          <w:sz w:val="28"/>
+          <w:szCs w:val="28"/>
+          <w:lang w:val="en-US"/>
+        </w:rPr>
+      </w:pPr>
+      <w:r>
+        <w:rPr>
+          <w:noProof/>
+          <w:lang w:val="en-US"/>
+        </w:rPr>
+        <w:t xml:space="preserve">Setelah pengajuan direspon, pengajuan tersebut akan berpindah ke </w:t>
+      </w:r>
+      <w:r>
+        <w:rPr>
+          <w:b/>
+          <w:bCs/>
+          <w:noProof/>
+          <w:lang w:val="en-US"/>
+        </w:rPr>
+        <w:t>cuti diterima</w:t>
+      </w:r>
+      <w:r>
+        <w:rPr>
+          <w:noProof/>
+          <w:lang w:val="en-US"/>
+        </w:rPr>
+        <w:t xml:space="preserve"> atau </w:t>
+      </w:r>
+      <w:r>
+        <w:rPr>
+          <w:b/>
+          <w:bCs/>
+          <w:noProof/>
+          <w:lang w:val="en-US"/>
+        </w:rPr>
+        <w:t>cuti ditolak</w:t>
+      </w:r>
+      <w:r>
+        <w:rPr>
+          <w:noProof/>
+          <w:lang w:val="en-US"/>
+        </w:rPr>
+        <w:t>. User (SDM) dapat melihat balasan respon tersebut</w:t>
+      </w:r>
+      <w:r>
+        <w:rPr>
+          <w:noProof/>
+          <w:lang w:val="en-US"/>
+        </w:rPr>
+        <w:t xml:space="preserve"> </w:t>
+      </w:r>
+      <w:r>
+        <w:rPr>
+          <w:b/>
+          <w:bCs/>
+          <w:noProof/>
+          <w:lang w:val="en-US"/>
+        </w:rPr>
+        <w:t>(nomor 1)</w:t>
+      </w:r>
+      <w:r>
+        <w:rPr>
+          <w:noProof/>
+          <w:lang w:val="en-US"/>
+        </w:rPr>
+        <w:t xml:space="preserve"> dan blanko pengajuan awal </w:t>
+      </w:r>
+      <w:r>
+        <w:rPr>
+          <w:b/>
+          <w:bCs/>
+          <w:noProof/>
+          <w:lang w:val="en-US"/>
+        </w:rPr>
+        <w:t>(nomor 2)</w:t>
+      </w:r>
+      <w:r>
+        <w:rPr>
           <w:noProof/>
           <w:lang w:val="en-US"/>
         </w:rPr>
@@ -5090,18 +5690,483 @@
           <w:tab w:val="left" w:leader="dot" w:pos="8789"/>
         </w:tabs>
         <w:spacing w:after="0" w:line="360" w:lineRule="auto"/>
+        <w:rPr>
+          <w:b/>
+          <w:bCs/>
+          <w:noProof/>
+          <w:sz w:val="28"/>
+          <w:szCs w:val="28"/>
+          <w:lang w:val="en-US"/>
+        </w:rPr>
+      </w:pPr>
+      <w:r>
+        <w:rPr>
+          <w:b/>
+          <w:bCs/>
+          <w:noProof/>
+          <w:sz w:val="28"/>
+          <w:szCs w:val="28"/>
+          <w:lang w:val="en-US"/>
+        </w:rPr>
+        <w:drawing>
+          <wp:anchor distT="0" distB="0" distL="114300" distR="114300" simplePos="0" relativeHeight="251659264" behindDoc="1" locked="0" layoutInCell="1" allowOverlap="1" wp14:anchorId="163D0BEA" wp14:editId="4120E285">
+            <wp:simplePos x="0" y="0"/>
+            <wp:positionH relativeFrom="margin">
+              <wp:align>right</wp:align>
+            </wp:positionH>
+            <wp:positionV relativeFrom="paragraph">
+              <wp:posOffset>13335</wp:posOffset>
+            </wp:positionV>
+            <wp:extent cx="5731510" cy="1746250"/>
+            <wp:effectExtent l="0" t="0" r="2540" b="6350"/>
+            <wp:wrapNone/>
+            <wp:docPr id="1328993794" name="Picture 6"/>
+            <wp:cNvGraphicFramePr>
+              <a:graphicFrameLocks xmlns:a="http://schemas.openxmlformats.org/drawingml/2006/main" noChangeAspect="1"/>
+            </wp:cNvGraphicFramePr>
+            <a:graphic xmlns:a="http://schemas.openxmlformats.org/drawingml/2006/main">
+              <a:graphicData uri="http://schemas.openxmlformats.org/drawingml/2006/picture">
+                <pic:pic xmlns:pic="http://schemas.openxmlformats.org/drawingml/2006/picture">
+                  <pic:nvPicPr>
+                    <pic:cNvPr id="1328993794" name="Picture 1328993794"/>
+                    <pic:cNvPicPr/>
+                  </pic:nvPicPr>
+                  <pic:blipFill>
+                    <a:blip r:embed="rId49" cstate="print">
+                      <a:extLst>
+                        <a:ext uri="{28A0092B-C50C-407E-A947-70E740481C1C}">
+                          <a14:useLocalDpi xmlns:a14="http://schemas.microsoft.com/office/drawing/2010/main" val="0"/>
+                        </a:ext>
+                      </a:extLst>
+                    </a:blip>
+                    <a:stretch>
+                      <a:fillRect/>
+                    </a:stretch>
+                  </pic:blipFill>
+                  <pic:spPr>
+                    <a:xfrm>
+                      <a:off x="0" y="0"/>
+                      <a:ext cx="5731510" cy="1746250"/>
+                    </a:xfrm>
+                    <a:prstGeom prst="rect">
+                      <a:avLst/>
+                    </a:prstGeom>
+                  </pic:spPr>
+                </pic:pic>
+              </a:graphicData>
+            </a:graphic>
+            <wp14:sizeRelH relativeFrom="page">
+              <wp14:pctWidth>0</wp14:pctWidth>
+            </wp14:sizeRelH>
+            <wp14:sizeRelV relativeFrom="page">
+              <wp14:pctHeight>0</wp14:pctHeight>
+            </wp14:sizeRelV>
+          </wp:anchor>
+        </w:drawing>
+      </w:r>
+    </w:p>
+    <w:p>
+      <w:pPr>
+        <w:tabs>
+          <w:tab w:val="left" w:leader="dot" w:pos="8789"/>
+        </w:tabs>
+        <w:spacing w:after="0" w:line="360" w:lineRule="auto"/>
+        <w:rPr>
+          <w:b/>
+          <w:bCs/>
+          <w:noProof/>
+          <w:sz w:val="28"/>
+          <w:szCs w:val="28"/>
+          <w:lang w:val="en-US"/>
+        </w:rPr>
+      </w:pPr>
+    </w:p>
+    <w:p>
+      <w:pPr>
+        <w:tabs>
+          <w:tab w:val="left" w:leader="dot" w:pos="8789"/>
+        </w:tabs>
+        <w:spacing w:after="0" w:line="360" w:lineRule="auto"/>
+        <w:rPr>
+          <w:b/>
+          <w:bCs/>
+          <w:noProof/>
+          <w:sz w:val="28"/>
+          <w:szCs w:val="28"/>
+          <w:lang w:val="en-US"/>
+        </w:rPr>
+      </w:pPr>
+    </w:p>
+    <w:p>
+      <w:pPr>
+        <w:tabs>
+          <w:tab w:val="left" w:leader="dot" w:pos="8789"/>
+        </w:tabs>
+        <w:spacing w:after="0" w:line="360" w:lineRule="auto"/>
+        <w:rPr>
+          <w:b/>
+          <w:bCs/>
+          <w:noProof/>
+          <w:sz w:val="28"/>
+          <w:szCs w:val="28"/>
+          <w:lang w:val="en-US"/>
+        </w:rPr>
+      </w:pPr>
+    </w:p>
+    <w:p>
+      <w:pPr>
+        <w:tabs>
+          <w:tab w:val="left" w:leader="dot" w:pos="8789"/>
+        </w:tabs>
+        <w:spacing w:after="0" w:line="360" w:lineRule="auto"/>
+        <w:rPr>
+          <w:b/>
+          <w:bCs/>
+          <w:noProof/>
+          <w:sz w:val="28"/>
+          <w:szCs w:val="28"/>
+          <w:lang w:val="en-US"/>
+        </w:rPr>
+      </w:pPr>
+    </w:p>
+    <w:p>
+      <w:pPr>
+        <w:tabs>
+          <w:tab w:val="left" w:leader="dot" w:pos="8789"/>
+        </w:tabs>
+        <w:spacing w:after="0" w:line="360" w:lineRule="auto"/>
+        <w:rPr>
+          <w:b/>
+          <w:bCs/>
+          <w:noProof/>
+          <w:sz w:val="28"/>
+          <w:szCs w:val="28"/>
+          <w:lang w:val="en-US"/>
+        </w:rPr>
+      </w:pPr>
+    </w:p>
+    <w:p>
+      <w:pPr>
+        <w:pStyle w:val="ListParagraph"/>
+        <w:numPr>
+          <w:ilvl w:val="0"/>
+          <w:numId w:val="9"/>
+        </w:numPr>
+        <w:tabs>
+          <w:tab w:val="left" w:leader="dot" w:pos="8789"/>
+        </w:tabs>
+        <w:spacing w:after="0" w:line="360" w:lineRule="auto"/>
+        <w:rPr>
+          <w:b/>
+          <w:bCs/>
+          <w:noProof/>
+          <w:sz w:val="28"/>
+          <w:szCs w:val="28"/>
+          <w:lang w:val="en-US"/>
+        </w:rPr>
+      </w:pPr>
+      <w:r>
+        <w:rPr>
+          <w:noProof/>
+          <w:lang w:val="en-US"/>
+        </w:rPr>
+        <w:t>Hak khusus yang hanya dimiliki SDM juga adalah dapat men-download semua data tabel pegawai, tabel pengajuan, tabel diterima, dan tabel ditolak.</w:t>
+      </w:r>
+    </w:p>
+    <w:p>
+      <w:pPr>
+        <w:tabs>
+          <w:tab w:val="left" w:leader="dot" w:pos="8789"/>
+        </w:tabs>
+        <w:spacing w:after="0" w:line="360" w:lineRule="auto"/>
         <w:jc w:val="center"/>
         <w:rPr>
           <w:b/>
           <w:bCs/>
           <w:noProof/>
-          <w:lang w:val="en-US"/>
-        </w:rPr>
-      </w:pPr>
-      <w:r>
-        <w:rPr>
-          <w:b/>
-          <w:bCs/>
+          <w:sz w:val="28"/>
+          <w:szCs w:val="28"/>
+          <w:lang w:val="en-US"/>
+        </w:rPr>
+      </w:pPr>
+      <w:r>
+        <w:rPr>
+          <w:b/>
+          <w:bCs/>
+          <w:noProof/>
+          <w:sz w:val="28"/>
+          <w:szCs w:val="28"/>
+          <w:lang w:val="en-US"/>
+        </w:rPr>
+        <w:drawing>
+          <wp:inline distT="0" distB="0" distL="0" distR="0" wp14:anchorId="2F60D3B9" wp14:editId="30A71A94">
+            <wp:extent cx="5731510" cy="848995"/>
+            <wp:effectExtent l="0" t="0" r="2540" b="8255"/>
+            <wp:docPr id="728302308" name="Picture 10"/>
+            <wp:cNvGraphicFramePr>
+              <a:graphicFrameLocks xmlns:a="http://schemas.openxmlformats.org/drawingml/2006/main" noChangeAspect="1"/>
+            </wp:cNvGraphicFramePr>
+            <a:graphic xmlns:a="http://schemas.openxmlformats.org/drawingml/2006/main">
+              <a:graphicData uri="http://schemas.openxmlformats.org/drawingml/2006/picture">
+                <pic:pic xmlns:pic="http://schemas.openxmlformats.org/drawingml/2006/picture">
+                  <pic:nvPicPr>
+                    <pic:cNvPr id="1658693441" name="Picture 1658693441"/>
+                    <pic:cNvPicPr/>
+                  </pic:nvPicPr>
+                  <pic:blipFill>
+                    <a:blip r:embed="rId41" cstate="print">
+                      <a:extLst>
+                        <a:ext uri="{28A0092B-C50C-407E-A947-70E740481C1C}">
+                          <a14:useLocalDpi xmlns:a14="http://schemas.microsoft.com/office/drawing/2010/main" val="0"/>
+                        </a:ext>
+                      </a:extLst>
+                    </a:blip>
+                    <a:stretch>
+                      <a:fillRect/>
+                    </a:stretch>
+                  </pic:blipFill>
+                  <pic:spPr>
+                    <a:xfrm>
+                      <a:off x="0" y="0"/>
+                      <a:ext cx="5731510" cy="848995"/>
+                    </a:xfrm>
+                    <a:prstGeom prst="rect">
+                      <a:avLst/>
+                    </a:prstGeom>
+                  </pic:spPr>
+                </pic:pic>
+              </a:graphicData>
+            </a:graphic>
+          </wp:inline>
+        </w:drawing>
+      </w:r>
+    </w:p>
+    <w:p>
+      <w:pPr>
+        <w:tabs>
+          <w:tab w:val="left" w:leader="dot" w:pos="8789"/>
+        </w:tabs>
+        <w:spacing w:after="0" w:line="360" w:lineRule="auto"/>
+        <w:jc w:val="center"/>
+        <w:rPr>
+          <w:b/>
+          <w:bCs/>
+          <w:noProof/>
+          <w:sz w:val="28"/>
+          <w:szCs w:val="28"/>
+          <w:lang w:val="en-US"/>
+        </w:rPr>
+      </w:pPr>
+      <w:r>
+        <w:rPr>
+          <w:b/>
+          <w:bCs/>
+          <w:noProof/>
+          <w:sz w:val="28"/>
+          <w:szCs w:val="28"/>
+          <w:lang w:val="en-US"/>
+        </w:rPr>
+        <w:drawing>
+          <wp:inline distT="0" distB="0" distL="0" distR="0" wp14:anchorId="15B3665A" wp14:editId="1E6A4238">
+            <wp:extent cx="5731510" cy="814705"/>
+            <wp:effectExtent l="0" t="0" r="2540" b="4445"/>
+            <wp:docPr id="971259623" name="Picture 11"/>
+            <wp:cNvGraphicFramePr>
+              <a:graphicFrameLocks xmlns:a="http://schemas.openxmlformats.org/drawingml/2006/main" noChangeAspect="1"/>
+            </wp:cNvGraphicFramePr>
+            <a:graphic xmlns:a="http://schemas.openxmlformats.org/drawingml/2006/main">
+              <a:graphicData uri="http://schemas.openxmlformats.org/drawingml/2006/picture">
+                <pic:pic xmlns:pic="http://schemas.openxmlformats.org/drawingml/2006/picture">
+                  <pic:nvPicPr>
+                    <pic:cNvPr id="349190715" name="Picture 349190715"/>
+                    <pic:cNvPicPr/>
+                  </pic:nvPicPr>
+                  <pic:blipFill>
+                    <a:blip r:embed="rId42" cstate="print">
+                      <a:extLst>
+                        <a:ext uri="{28A0092B-C50C-407E-A947-70E740481C1C}">
+                          <a14:useLocalDpi xmlns:a14="http://schemas.microsoft.com/office/drawing/2010/main" val="0"/>
+                        </a:ext>
+                      </a:extLst>
+                    </a:blip>
+                    <a:stretch>
+                      <a:fillRect/>
+                    </a:stretch>
+                  </pic:blipFill>
+                  <pic:spPr>
+                    <a:xfrm>
+                      <a:off x="0" y="0"/>
+                      <a:ext cx="5731510" cy="814705"/>
+                    </a:xfrm>
+                    <a:prstGeom prst="rect">
+                      <a:avLst/>
+                    </a:prstGeom>
+                  </pic:spPr>
+                </pic:pic>
+              </a:graphicData>
+            </a:graphic>
+          </wp:inline>
+        </w:drawing>
+      </w:r>
+    </w:p>
+    <w:p>
+      <w:pPr>
+        <w:tabs>
+          <w:tab w:val="left" w:leader="dot" w:pos="8789"/>
+        </w:tabs>
+        <w:spacing w:after="0" w:line="360" w:lineRule="auto"/>
+        <w:jc w:val="center"/>
+        <w:rPr>
+          <w:b/>
+          <w:bCs/>
+          <w:noProof/>
+          <w:sz w:val="28"/>
+          <w:szCs w:val="28"/>
+          <w:lang w:val="en-US"/>
+        </w:rPr>
+      </w:pPr>
+      <w:r>
+        <w:rPr>
+          <w:b/>
+          <w:bCs/>
+          <w:noProof/>
+          <w:sz w:val="28"/>
+          <w:szCs w:val="28"/>
+          <w:lang w:val="en-US"/>
+        </w:rPr>
+        <w:drawing>
+          <wp:inline distT="0" distB="0" distL="0" distR="0" wp14:anchorId="6D7B28AC" wp14:editId="28D42F85">
+            <wp:extent cx="5731510" cy="829945"/>
+            <wp:effectExtent l="0" t="0" r="2540" b="8255"/>
+            <wp:docPr id="1061373651" name="Picture 12"/>
+            <wp:cNvGraphicFramePr>
+              <a:graphicFrameLocks xmlns:a="http://schemas.openxmlformats.org/drawingml/2006/main" noChangeAspect="1"/>
+            </wp:cNvGraphicFramePr>
+            <a:graphic xmlns:a="http://schemas.openxmlformats.org/drawingml/2006/main">
+              <a:graphicData uri="http://schemas.openxmlformats.org/drawingml/2006/picture">
+                <pic:pic xmlns:pic="http://schemas.openxmlformats.org/drawingml/2006/picture">
+                  <pic:nvPicPr>
+                    <pic:cNvPr id="2085319691" name="Picture 2085319691"/>
+                    <pic:cNvPicPr/>
+                  </pic:nvPicPr>
+                  <pic:blipFill>
+                    <a:blip r:embed="rId43" cstate="print">
+                      <a:extLst>
+                        <a:ext uri="{28A0092B-C50C-407E-A947-70E740481C1C}">
+                          <a14:useLocalDpi xmlns:a14="http://schemas.microsoft.com/office/drawing/2010/main" val="0"/>
+                        </a:ext>
+                      </a:extLst>
+                    </a:blip>
+                    <a:stretch>
+                      <a:fillRect/>
+                    </a:stretch>
+                  </pic:blipFill>
+                  <pic:spPr>
+                    <a:xfrm>
+                      <a:off x="0" y="0"/>
+                      <a:ext cx="5731510" cy="829945"/>
+                    </a:xfrm>
+                    <a:prstGeom prst="rect">
+                      <a:avLst/>
+                    </a:prstGeom>
+                  </pic:spPr>
+                </pic:pic>
+              </a:graphicData>
+            </a:graphic>
+          </wp:inline>
+        </w:drawing>
+      </w:r>
+    </w:p>
+    <w:p>
+      <w:pPr>
+        <w:tabs>
+          <w:tab w:val="left" w:leader="dot" w:pos="8789"/>
+        </w:tabs>
+        <w:spacing w:after="0" w:line="360" w:lineRule="auto"/>
+        <w:jc w:val="center"/>
+        <w:rPr>
+          <w:b/>
+          <w:bCs/>
+          <w:noProof/>
+          <w:sz w:val="28"/>
+          <w:szCs w:val="28"/>
+          <w:lang w:val="en-US"/>
+        </w:rPr>
+      </w:pPr>
+      <w:r>
+        <w:rPr>
+          <w:b/>
+          <w:bCs/>
+          <w:noProof/>
+          <w:sz w:val="28"/>
+          <w:szCs w:val="28"/>
+          <w:lang w:val="en-US"/>
+        </w:rPr>
+        <w:drawing>
+          <wp:inline distT="0" distB="0" distL="0" distR="0" wp14:anchorId="6F2FBD7B" wp14:editId="1585126B">
+            <wp:extent cx="5731510" cy="1116965"/>
+            <wp:effectExtent l="0" t="0" r="2540" b="6985"/>
+            <wp:docPr id="235494409" name="Picture 13"/>
+            <wp:cNvGraphicFramePr>
+              <a:graphicFrameLocks xmlns:a="http://schemas.openxmlformats.org/drawingml/2006/main" noChangeAspect="1"/>
+            </wp:cNvGraphicFramePr>
+            <a:graphic xmlns:a="http://schemas.openxmlformats.org/drawingml/2006/main">
+              <a:graphicData uri="http://schemas.openxmlformats.org/drawingml/2006/picture">
+                <pic:pic xmlns:pic="http://schemas.openxmlformats.org/drawingml/2006/picture">
+                  <pic:nvPicPr>
+                    <pic:cNvPr id="43239032" name="Picture 43239032"/>
+                    <pic:cNvPicPr/>
+                  </pic:nvPicPr>
+                  <pic:blipFill>
+                    <a:blip r:embed="rId44" cstate="print">
+                      <a:extLst>
+                        <a:ext uri="{28A0092B-C50C-407E-A947-70E740481C1C}">
+                          <a14:useLocalDpi xmlns:a14="http://schemas.microsoft.com/office/drawing/2010/main" val="0"/>
+                        </a:ext>
+                      </a:extLst>
+                    </a:blip>
+                    <a:stretch>
+                      <a:fillRect/>
+                    </a:stretch>
+                  </pic:blipFill>
+                  <pic:spPr>
+                    <a:xfrm>
+                      <a:off x="0" y="0"/>
+                      <a:ext cx="5731510" cy="1116965"/>
+                    </a:xfrm>
+                    <a:prstGeom prst="rect">
+                      <a:avLst/>
+                    </a:prstGeom>
+                  </pic:spPr>
+                </pic:pic>
+              </a:graphicData>
+            </a:graphic>
+          </wp:inline>
+        </w:drawing>
+      </w:r>
+    </w:p>
+    <w:p>
+      <w:pPr>
+        <w:pStyle w:val="ListParagraph"/>
+        <w:numPr>
+          <w:ilvl w:val="0"/>
+          <w:numId w:val="9"/>
+        </w:numPr>
+        <w:tabs>
+          <w:tab w:val="left" w:leader="dot" w:pos="8789"/>
+        </w:tabs>
+        <w:spacing w:after="0" w:line="360" w:lineRule="auto"/>
+        <w:rPr>
+          <w:b/>
+          <w:bCs/>
+          <w:noProof/>
+          <w:sz w:val="28"/>
+          <w:szCs w:val="28"/>
+          <w:lang w:val="en-US"/>
+        </w:rPr>
+      </w:pPr>
+      <w:r>
+        <w:rPr>
           <w:noProof/>
           <w:lang w:val="en-US"/>
         </w:rPr>
@@ -5114,94 +6179,48 @@
           <w:tab w:val="left" w:leader="dot" w:pos="8789"/>
         </w:tabs>
         <w:spacing w:after="0" w:line="360" w:lineRule="auto"/>
-        <w:jc w:val="center"/>
-        <w:rPr>
-          <w:b/>
-          <w:bCs/>
-          <w:noProof/>
-          <w:lang w:val="en-US"/>
-        </w:rPr>
-      </w:pPr>
-      <w:r>
-        <w:rPr>
-          <w:b/>
-          <w:bCs/>
-          <w:noProof/>
-          <w:lang w:val="en-US"/>
-        </w:rPr>
-        <w:t>.</w:t>
-      </w:r>
-    </w:p>
-    <w:p>
-      <w:pPr>
-        <w:tabs>
-          <w:tab w:val="left" w:leader="dot" w:pos="8789"/>
-        </w:tabs>
-        <w:spacing w:after="0" w:line="360" w:lineRule="auto"/>
-        <w:jc w:val="center"/>
-        <w:rPr>
-          <w:b/>
-          <w:bCs/>
-          <w:noProof/>
-          <w:lang w:val="en-US"/>
-        </w:rPr>
-      </w:pPr>
-      <w:r>
-        <w:rPr>
-          <w:b/>
-          <w:bCs/>
-          <w:noProof/>
-          <w:lang w:val="en-US"/>
-        </w:rPr>
-        <w:t>.</w:t>
-      </w:r>
-    </w:p>
-    <w:p>
-      <w:pPr>
-        <w:tabs>
-          <w:tab w:val="left" w:leader="dot" w:pos="8789"/>
-        </w:tabs>
-        <w:spacing w:after="0" w:line="360" w:lineRule="auto"/>
-        <w:jc w:val="center"/>
-        <w:rPr>
-          <w:b/>
-          <w:bCs/>
-          <w:noProof/>
-          <w:lang w:val="en-US"/>
-        </w:rPr>
-      </w:pPr>
-      <w:r>
-        <w:rPr>
-          <w:b/>
-          <w:bCs/>
-          <w:noProof/>
-          <w:lang w:val="en-US"/>
-        </w:rPr>
-        <w:t>.</w:t>
-      </w:r>
-    </w:p>
-    <w:p>
-      <w:pPr>
-        <w:tabs>
-          <w:tab w:val="left" w:leader="dot" w:pos="8789"/>
-        </w:tabs>
-        <w:spacing w:after="0" w:line="360" w:lineRule="auto"/>
-        <w:jc w:val="center"/>
-        <w:rPr>
-          <w:b/>
-          <w:bCs/>
-          <w:noProof/>
-          <w:lang w:val="en-US"/>
-        </w:rPr>
-      </w:pPr>
-    </w:p>
-    <w:p>
-      <w:pPr>
-        <w:tabs>
-          <w:tab w:val="left" w:leader="dot" w:pos="8789"/>
-        </w:tabs>
-        <w:spacing w:after="0" w:line="360" w:lineRule="auto"/>
-        <w:jc w:val="center"/>
+        <w:rPr>
+          <w:b/>
+          <w:bCs/>
+          <w:noProof/>
+          <w:lang w:val="en-US"/>
+        </w:rPr>
+      </w:pPr>
+    </w:p>
+    <w:p>
+      <w:pPr>
+        <w:tabs>
+          <w:tab w:val="left" w:leader="dot" w:pos="8789"/>
+        </w:tabs>
+        <w:spacing w:after="0" w:line="360" w:lineRule="auto"/>
+        <w:rPr>
+          <w:b/>
+          <w:bCs/>
+          <w:noProof/>
+          <w:lang w:val="en-US"/>
+        </w:rPr>
+      </w:pPr>
+    </w:p>
+    <w:p>
+      <w:pPr>
+        <w:tabs>
+          <w:tab w:val="left" w:leader="dot" w:pos="8789"/>
+        </w:tabs>
+        <w:spacing w:after="0" w:line="360" w:lineRule="auto"/>
+        <w:rPr>
+          <w:b/>
+          <w:bCs/>
+          <w:noProof/>
+          <w:lang w:val="en-US"/>
+        </w:rPr>
+      </w:pPr>
+    </w:p>
+    <w:p>
+      <w:pPr>
+        <w:tabs>
+          <w:tab w:val="left" w:leader="dot" w:pos="8789"/>
+        </w:tabs>
+        <w:spacing w:after="0" w:line="360" w:lineRule="auto"/>
         <w:rPr>
           <w:b/>
           <w:bCs/>
@@ -5363,6 +6382,7 @@
           <w:noProof/>
           <w:lang w:val="id-ID"/>
         </w:rPr>
+        <w:lastRenderedPageBreak/>
         <w:t>“Bagaimana cara pegawai RRI di sini mengajukan cuti, Pak?” - P</w:t>
       </w:r>
     </w:p>
@@ -5384,7 +6404,6 @@
           <w:noProof/>
           <w:lang w:val="id-ID"/>
         </w:rPr>
-        <w:lastRenderedPageBreak/>
         <w:t>“Pegawai disini mengajukan cuti melalui SDM, lalu SDM nanti akan mengirimkan blanko pengajuan kepada Direktur RRI Palembang untuk di konfirmasi” - OZ</w:t>
       </w:r>
     </w:p>
@@ -5429,7 +6448,51 @@
           <w:noProof/>
           <w:lang w:val="id-ID"/>
         </w:rPr>
-        <w:t>“Iya, tetapi hanya berbasis pesan pribadi seperti menggunakan Whatsapp. Jadi, kadang takutnya data yang dikirimkan bisa saja hilang. Apalagi jika data ingin di recap, jadi susah. Juga, mengirim melalui pesan pribadi kesannya seperti tidak modern dan tidak formal.” - OZ</w:t>
+        <w:t xml:space="preserve">“Iya, tetapi </w:t>
+      </w:r>
+      <w:r>
+        <w:rPr>
+          <w:noProof/>
+          <w:lang w:val="id-ID"/>
+        </w:rPr>
+        <w:t>masih</w:t>
+      </w:r>
+      <w:r>
+        <w:rPr>
+          <w:noProof/>
+          <w:lang w:val="id-ID"/>
+        </w:rPr>
+        <w:t xml:space="preserve"> berbasis pesan pribadi seperti menggunakan Whatsapp. Jadi, kadang takutnya data yang dikirimkan bisa saja hilang. Apalagi jika data ingin di </w:t>
+      </w:r>
+      <w:r>
+        <w:rPr>
+          <w:i/>
+          <w:iCs/>
+          <w:noProof/>
+          <w:lang w:val="id-ID"/>
+        </w:rPr>
+        <w:t>recap</w:t>
+      </w:r>
+      <w:r>
+        <w:rPr>
+          <w:noProof/>
+          <w:lang w:val="id-ID"/>
+        </w:rPr>
+        <w:t xml:space="preserve">, jadi susah. Juga, mengirim melalui pesan pribadi kesannya seperti tidak </w:t>
+      </w:r>
+      <w:r>
+        <w:rPr>
+          <w:noProof/>
+          <w:lang w:val="id-ID"/>
+        </w:rPr>
+        <w:t>autentik</w:t>
+      </w:r>
+      <w:r>
+        <w:rPr>
+          <w:noProof/>
+          <w:lang w:val="id-ID"/>
+        </w:rPr>
+        <w:t xml:space="preserve"> dan tidak formal.” - OZ</w:t>
       </w:r>
     </w:p>
     <w:sectPr>
@@ -5623,6 +6686,95 @@
     </w:lvl>
   </w:abstractNum>
   <w:abstractNum w:abstractNumId="2" w15:restartNumberingAfterBreak="0">
+    <w:nsid w:val="1FDE30FB"/>
+    <w:multiLevelType w:val="hybridMultilevel"/>
+    <w:tmpl w:val="282A1634"/>
+    <w:lvl w:ilvl="0" w:tplc="FFFFFFFF">
+      <w:start w:val="1"/>
+      <w:numFmt w:val="lowerLetter"/>
+      <w:lvlText w:val="%1."/>
+      <w:lvlJc w:val="left"/>
+      <w:pPr>
+        <w:ind w:left="720" w:hanging="360"/>
+      </w:pPr>
+      <w:rPr>
+        <w:rFonts w:hint="default"/>
+      </w:rPr>
+    </w:lvl>
+    <w:lvl w:ilvl="1" w:tplc="FFFFFFFF" w:tentative="1">
+      <w:start w:val="1"/>
+      <w:numFmt w:val="lowerLetter"/>
+      <w:lvlText w:val="%2."/>
+      <w:lvlJc w:val="left"/>
+      <w:pPr>
+        <w:ind w:left="1440" w:hanging="360"/>
+      </w:pPr>
+    </w:lvl>
+    <w:lvl w:ilvl="2" w:tplc="FFFFFFFF" w:tentative="1">
+      <w:start w:val="1"/>
+      <w:numFmt w:val="lowerRoman"/>
+      <w:lvlText w:val="%3."/>
+      <w:lvlJc w:val="right"/>
+      <w:pPr>
+        <w:ind w:left="2160" w:hanging="180"/>
+      </w:pPr>
+    </w:lvl>
+    <w:lvl w:ilvl="3" w:tplc="FFFFFFFF" w:tentative="1">
+      <w:start w:val="1"/>
+      <w:numFmt w:val="decimal"/>
+      <w:lvlText w:val="%4."/>
+      <w:lvlJc w:val="left"/>
+      <w:pPr>
+        <w:ind w:left="2880" w:hanging="360"/>
+      </w:pPr>
+    </w:lvl>
+    <w:lvl w:ilvl="4" w:tplc="FFFFFFFF" w:tentative="1">
+      <w:start w:val="1"/>
+      <w:numFmt w:val="lowerLetter"/>
+      <w:lvlText w:val="%5."/>
+      <w:lvlJc w:val="left"/>
+      <w:pPr>
+        <w:ind w:left="3600" w:hanging="360"/>
+      </w:pPr>
+    </w:lvl>
+    <w:lvl w:ilvl="5" w:tplc="FFFFFFFF" w:tentative="1">
+      <w:start w:val="1"/>
+      <w:numFmt w:val="lowerRoman"/>
+      <w:lvlText w:val="%6."/>
+      <w:lvlJc w:val="right"/>
+      <w:pPr>
+        <w:ind w:left="4320" w:hanging="180"/>
+      </w:pPr>
+    </w:lvl>
+    <w:lvl w:ilvl="6" w:tplc="FFFFFFFF" w:tentative="1">
+      <w:start w:val="1"/>
+      <w:numFmt w:val="decimal"/>
+      <w:lvlText w:val="%7."/>
+      <w:lvlJc w:val="left"/>
+      <w:pPr>
+        <w:ind w:left="5040" w:hanging="360"/>
+      </w:pPr>
+    </w:lvl>
+    <w:lvl w:ilvl="7" w:tplc="FFFFFFFF" w:tentative="1">
+      <w:start w:val="1"/>
+      <w:numFmt w:val="lowerLetter"/>
+      <w:lvlText w:val="%8."/>
+      <w:lvlJc w:val="left"/>
+      <w:pPr>
+        <w:ind w:left="5760" w:hanging="360"/>
+      </w:pPr>
+    </w:lvl>
+    <w:lvl w:ilvl="8" w:tplc="FFFFFFFF" w:tentative="1">
+      <w:start w:val="1"/>
+      <w:numFmt w:val="lowerRoman"/>
+      <w:lvlText w:val="%9."/>
+      <w:lvlJc w:val="right"/>
+      <w:pPr>
+        <w:ind w:left="6480" w:hanging="180"/>
+      </w:pPr>
+    </w:lvl>
+  </w:abstractNum>
+  <w:abstractNum w:abstractNumId="3" w15:restartNumberingAfterBreak="0">
     <w:nsid w:val="305E387B"/>
     <w:multiLevelType w:val="hybridMultilevel"/>
     <w:tmpl w:val="F916793E"/>
@@ -5715,7 +6867,7 @@
       </w:pPr>
     </w:lvl>
   </w:abstractNum>
-  <w:abstractNum w:abstractNumId="3" w15:restartNumberingAfterBreak="0">
+  <w:abstractNum w:abstractNumId="4" w15:restartNumberingAfterBreak="0">
     <w:nsid w:val="36E767A7"/>
     <w:multiLevelType w:val="hybridMultilevel"/>
     <w:tmpl w:val="282A1634"/>
@@ -5804,7 +6956,7 @@
       </w:pPr>
     </w:lvl>
   </w:abstractNum>
-  <w:abstractNum w:abstractNumId="4" w15:restartNumberingAfterBreak="0">
+  <w:abstractNum w:abstractNumId="5" w15:restartNumberingAfterBreak="0">
     <w:nsid w:val="56F1301F"/>
     <w:multiLevelType w:val="hybridMultilevel"/>
     <w:tmpl w:val="A2C2584E"/>
@@ -5895,7 +7047,7 @@
       </w:pPr>
     </w:lvl>
   </w:abstractNum>
-  <w:abstractNum w:abstractNumId="5" w15:restartNumberingAfterBreak="0">
+  <w:abstractNum w:abstractNumId="6" w15:restartNumberingAfterBreak="0">
     <w:nsid w:val="5DAB21F8"/>
     <w:multiLevelType w:val="hybridMultilevel"/>
     <w:tmpl w:val="3836E60A"/>
@@ -5984,7 +7136,96 @@
       </w:pPr>
     </w:lvl>
   </w:abstractNum>
-  <w:abstractNum w:abstractNumId="6" w15:restartNumberingAfterBreak="0">
+  <w:abstractNum w:abstractNumId="7" w15:restartNumberingAfterBreak="0">
+    <w:nsid w:val="6B5A1934"/>
+    <w:multiLevelType w:val="hybridMultilevel"/>
+    <w:tmpl w:val="282A1634"/>
+    <w:lvl w:ilvl="0" w:tplc="FFFFFFFF">
+      <w:start w:val="1"/>
+      <w:numFmt w:val="lowerLetter"/>
+      <w:lvlText w:val="%1."/>
+      <w:lvlJc w:val="left"/>
+      <w:pPr>
+        <w:ind w:left="720" w:hanging="360"/>
+      </w:pPr>
+      <w:rPr>
+        <w:rFonts w:hint="default"/>
+      </w:rPr>
+    </w:lvl>
+    <w:lvl w:ilvl="1" w:tplc="FFFFFFFF" w:tentative="1">
+      <w:start w:val="1"/>
+      <w:numFmt w:val="lowerLetter"/>
+      <w:lvlText w:val="%2."/>
+      <w:lvlJc w:val="left"/>
+      <w:pPr>
+        <w:ind w:left="1440" w:hanging="360"/>
+      </w:pPr>
+    </w:lvl>
+    <w:lvl w:ilvl="2" w:tplc="FFFFFFFF" w:tentative="1">
+      <w:start w:val="1"/>
+      <w:numFmt w:val="lowerRoman"/>
+      <w:lvlText w:val="%3."/>
+      <w:lvlJc w:val="right"/>
+      <w:pPr>
+        <w:ind w:left="2160" w:hanging="180"/>
+      </w:pPr>
+    </w:lvl>
+    <w:lvl w:ilvl="3" w:tplc="FFFFFFFF" w:tentative="1">
+      <w:start w:val="1"/>
+      <w:numFmt w:val="decimal"/>
+      <w:lvlText w:val="%4."/>
+      <w:lvlJc w:val="left"/>
+      <w:pPr>
+        <w:ind w:left="2880" w:hanging="360"/>
+      </w:pPr>
+    </w:lvl>
+    <w:lvl w:ilvl="4" w:tplc="FFFFFFFF" w:tentative="1">
+      <w:start w:val="1"/>
+      <w:numFmt w:val="lowerLetter"/>
+      <w:lvlText w:val="%5."/>
+      <w:lvlJc w:val="left"/>
+      <w:pPr>
+        <w:ind w:left="3600" w:hanging="360"/>
+      </w:pPr>
+    </w:lvl>
+    <w:lvl w:ilvl="5" w:tplc="FFFFFFFF" w:tentative="1">
+      <w:start w:val="1"/>
+      <w:numFmt w:val="lowerRoman"/>
+      <w:lvlText w:val="%6."/>
+      <w:lvlJc w:val="right"/>
+      <w:pPr>
+        <w:ind w:left="4320" w:hanging="180"/>
+      </w:pPr>
+    </w:lvl>
+    <w:lvl w:ilvl="6" w:tplc="FFFFFFFF" w:tentative="1">
+      <w:start w:val="1"/>
+      <w:numFmt w:val="decimal"/>
+      <w:lvlText w:val="%7."/>
+      <w:lvlJc w:val="left"/>
+      <w:pPr>
+        <w:ind w:left="5040" w:hanging="360"/>
+      </w:pPr>
+    </w:lvl>
+    <w:lvl w:ilvl="7" w:tplc="FFFFFFFF" w:tentative="1">
+      <w:start w:val="1"/>
+      <w:numFmt w:val="lowerLetter"/>
+      <w:lvlText w:val="%8."/>
+      <w:lvlJc w:val="left"/>
+      <w:pPr>
+        <w:ind w:left="5760" w:hanging="360"/>
+      </w:pPr>
+    </w:lvl>
+    <w:lvl w:ilvl="8" w:tplc="FFFFFFFF" w:tentative="1">
+      <w:start w:val="1"/>
+      <w:numFmt w:val="lowerRoman"/>
+      <w:lvlText w:val="%9."/>
+      <w:lvlJc w:val="right"/>
+      <w:pPr>
+        <w:ind w:left="6480" w:hanging="180"/>
+      </w:pPr>
+    </w:lvl>
+  </w:abstractNum>
+  <w:abstractNum w:abstractNumId="8" w15:restartNumberingAfterBreak="0">
     <w:nsid w:val="778577EC"/>
     <w:multiLevelType w:val="hybridMultilevel"/>
     <w:tmpl w:val="C61214A4"/>
@@ -6077,7 +7318,7 @@
       </w:pPr>
     </w:lvl>
   </w:abstractNum>
-  <w:abstractNum w:abstractNumId="7" w15:restartNumberingAfterBreak="0">
+  <w:abstractNum w:abstractNumId="9" w15:restartNumberingAfterBreak="0">
     <w:nsid w:val="7C436569"/>
     <w:multiLevelType w:val="hybridMultilevel"/>
     <w:tmpl w:val="282A1634"/>
@@ -6167,28 +7408,34 @@
     </w:lvl>
   </w:abstractNum>
   <w:num w:numId="1" w16cid:durableId="1327587404">
+    <w:abstractNumId w:val="5"/>
+  </w:num>
+  <w:num w:numId="2" w16cid:durableId="1495686188">
+    <w:abstractNumId w:val="8"/>
+  </w:num>
+  <w:num w:numId="3" w16cid:durableId="979768494">
+    <w:abstractNumId w:val="3"/>
+  </w:num>
+  <w:num w:numId="4" w16cid:durableId="1295671504">
+    <w:abstractNumId w:val="6"/>
+  </w:num>
+  <w:num w:numId="5" w16cid:durableId="54863644">
     <w:abstractNumId w:val="4"/>
   </w:num>
-  <w:num w:numId="2" w16cid:durableId="1495686188">
-    <w:abstractNumId w:val="6"/>
-  </w:num>
-  <w:num w:numId="3" w16cid:durableId="979768494">
-    <w:abstractNumId w:val="2"/>
-  </w:num>
-  <w:num w:numId="4" w16cid:durableId="1295671504">
-    <w:abstractNumId w:val="5"/>
-  </w:num>
-  <w:num w:numId="5" w16cid:durableId="54863644">
-    <w:abstractNumId w:val="3"/>
-  </w:num>
   <w:num w:numId="6" w16cid:durableId="739644584">
-    <w:abstractNumId w:val="7"/>
+    <w:abstractNumId w:val="9"/>
   </w:num>
   <w:num w:numId="7" w16cid:durableId="257982019">
     <w:abstractNumId w:val="0"/>
   </w:num>
   <w:num w:numId="8" w16cid:durableId="506360233">
     <w:abstractNumId w:val="1"/>
+  </w:num>
+  <w:num w:numId="9" w16cid:durableId="273054862">
+    <w:abstractNumId w:val="7"/>
+  </w:num>
+  <w:num w:numId="10" w16cid:durableId="1122727074">
+    <w:abstractNumId w:val="2"/>
   </w:num>
 </w:numbering>
 </file>
@@ -6593,11 +7840,12 @@
   <w:style w:type="paragraph" w:default="1" w:styleId="Normal">
     <w:name w:val="Normal"/>
     <w:qFormat/>
-    <w:rsid w:val="00604A7A"/>
+    <w:rsid w:val="00473F67"/>
   </w:style>
   <w:style w:type="character" w:default="1" w:styleId="DefaultParagraphFont">
     <w:name w:val="Default Paragraph Font"/>
     <w:uiPriority w:val="1"/>
+    <w:semiHidden/>
     <w:unhideWhenUsed/>
   </w:style>
   <w:style w:type="table" w:default="1" w:styleId="TableNormal">

</xml_diff>